<commit_message>
docs: move practice 1 and 2 blanks to Практики and fill practice 3 quality requirements
</commit_message>
<xml_diff>
--- a/Практики/Практическое_занятие_№3_—_проверяемые_требования_к_качеству.docx
+++ b/Практики/Практическое_занятие_№3_—_проверяемые_требования_к_качеству.docx
@@ -4,365 +4,508 @@
   <w:body>
     <w:p>
       <w:pPr>
-        <w:spacing w:before="0" w:after="40"/>
+        <w:spacing w:before="0" w:after="40" w:line="276" w:lineRule="auto"/>
+        <w:jc w:val="center"/>
       </w:pPr>
       <w:r>
         <w:rPr>
-          <w:rFonts w:ascii="Times New Roman" w:hAnsi="Times New Roman" w:eastAsia="Times New Roman"/>
+          <w:rFonts w:ascii="Times New Roman" w:hAnsi="Times New Roman"/>
           <w:b/>
           <w:i w:val="0"/>
-          <w:sz w:val="28"/>
+          <w:sz w:val="32"/>
         </w:rPr>
         <w:t>Практическое занятие №3</w:t>
       </w:r>
     </w:p>
     <w:p>
       <w:pPr>
-        <w:spacing w:before="40" w:after="120"/>
+        <w:spacing w:before="0" w:after="120" w:line="276" w:lineRule="auto"/>
+        <w:jc w:val="center"/>
       </w:pPr>
       <w:r>
         <w:rPr>
-          <w:rFonts w:ascii="Calibri" w:hAnsi="Calibri" w:eastAsia="Calibri"/>
+          <w:rFonts w:ascii="Times New Roman" w:hAnsi="Times New Roman"/>
           <w:b/>
           <w:i w:val="0"/>
-          <w:sz w:val="22"/>
+          <w:sz w:val="26"/>
         </w:rPr>
-        <w:t xml:space="preserve">Тема: </w:t>
-      </w:r>
-      <w:r>
-        <w:rPr>
-          <w:rFonts w:ascii="Calibri" w:hAnsi="Calibri" w:eastAsia="Calibri"/>
-          <w:b/>
-          <w:i w:val="0"/>
-          <w:sz w:val="22"/>
-        </w:rPr>
-        <w:t>Use Case и пользовательские сценарии</w:t>
+        <w:t>Тема: Use Case и пользовательские сценарии</w:t>
       </w:r>
     </w:p>
     <w:p>
       <w:pPr>
-        <w:spacing w:before="40" w:after="120"/>
+        <w:spacing w:before="0" w:after="240" w:line="276" w:lineRule="auto"/>
+        <w:jc w:val="center"/>
       </w:pPr>
       <w:r>
         <w:rPr>
-          <w:rFonts w:ascii="Calibri" w:hAnsi="Calibri" w:eastAsia="Calibri"/>
+          <w:rFonts w:ascii="Times New Roman" w:hAnsi="Times New Roman"/>
           <w:b/>
-          <w:i w:val="0"/>
           <w:sz w:val="22"/>
         </w:rPr>
-        <w:t xml:space="preserve">Дополнительный материал: </w:t>
+        <w:t xml:space="preserve">Проект: </w:t>
       </w:r>
       <w:r>
         <w:rPr>
-          <w:rFonts w:ascii="Calibri" w:hAnsi="Calibri" w:eastAsia="Calibri"/>
-          <w:b/>
-          <w:i w:val="0"/>
+          <w:rFonts w:ascii="Times New Roman" w:hAnsi="Times New Roman"/>
           <w:sz w:val="22"/>
         </w:rPr>
-        <w:t>Требование к качеству должно быть проверяемым</w:t>
+        <w:t>«Умный ресторан: 2D-конструктор схем залов и онлайн-бронирование столов»</w:t>
+        <w:br/>
+      </w:r>
+      <w:r>
+        <w:rPr>
+          <w:rFonts w:ascii="Times New Roman" w:hAnsi="Times New Roman"/>
+          <w:b/>
+          <w:sz w:val="22"/>
+        </w:rPr>
+        <w:t xml:space="preserve">Группа: </w:t>
+      </w:r>
+      <w:r>
+        <w:rPr>
+          <w:rFonts w:ascii="Times New Roman" w:hAnsi="Times New Roman"/>
+          <w:sz w:val="22"/>
+        </w:rPr>
+        <w:t xml:space="preserve">ЭФБО-13-25   |   </w:t>
+      </w:r>
+      <w:r>
+        <w:rPr>
+          <w:rFonts w:ascii="Times New Roman" w:hAnsi="Times New Roman"/>
+          <w:b/>
+          <w:sz w:val="22"/>
+        </w:rPr>
+        <w:t xml:space="preserve">Команда: </w:t>
+      </w:r>
+      <w:r>
+        <w:rPr>
+          <w:rFonts w:ascii="Times New Roman" w:hAnsi="Times New Roman"/>
+          <w:sz w:val="22"/>
+        </w:rPr>
+        <w:t xml:space="preserve">Вкусно_и_Жир   |   </w:t>
+      </w:r>
+      <w:r>
+        <w:rPr>
+          <w:rFonts w:ascii="Times New Roman" w:hAnsi="Times New Roman"/>
+          <w:b/>
+          <w:sz w:val="22"/>
+        </w:rPr>
+        <w:t xml:space="preserve">Дата: </w:t>
+      </w:r>
+      <w:r>
+        <w:rPr>
+          <w:rFonts w:ascii="Times New Roman" w:hAnsi="Times New Roman"/>
+          <w:sz w:val="22"/>
+        </w:rPr>
+        <w:t>10.10.2026</w:t>
       </w:r>
     </w:p>
     <w:p>
       <w:pPr>
-        <w:spacing w:before="0" w:after="80"/>
-        <w:jc w:val="both"/>
+        <w:spacing w:before="120" w:after="120" w:line="276" w:lineRule="auto"/>
+        <w:jc w:val="left"/>
       </w:pPr>
       <w:r>
         <w:rPr>
-          <w:rFonts w:ascii="Times New Roman" w:hAnsi="Times New Roman" w:eastAsia="Times New Roman"/>
-          <w:b w:val="0"/>
+          <w:rFonts w:ascii="Times New Roman" w:hAnsi="Times New Roman"/>
+          <w:b/>
           <w:i w:val="0"/>
+          <w:sz w:val="26"/>
         </w:rPr>
-        <w:t>Формулировки «система работает быстро», «сервис надёжный», «интерфейс удобный» кажутся понятными, пока не начинается приёмка. Тогда выясняется, что заказчик под «быстро» понимал одну секунду, а команда — десять. Спорить не о чем: требование не говорит, что считать выполненным. Поэтому требование к качеству записывают так, чтобы его можно было проверить.</w:t>
+        <w:t>Дополнительный материал команды: Требование к качеству должно быть проверяемым</w:t>
       </w:r>
     </w:p>
     <w:p>
       <w:pPr>
-        <w:spacing w:before="0" w:after="80"/>
-        <w:jc w:val="both"/>
+        <w:spacing w:before="0" w:after="120" w:line="276" w:lineRule="auto"/>
+        <w:jc w:val="left"/>
       </w:pPr>
       <w:r>
         <w:rPr>
-          <w:rFonts w:ascii="Times New Roman" w:hAnsi="Times New Roman" w:eastAsia="Times New Roman"/>
+          <w:rFonts w:ascii="Times New Roman" w:hAnsi="Times New Roman"/>
           <w:b w:val="0"/>
           <w:i w:val="0"/>
+          <w:sz w:val="24"/>
         </w:rPr>
-        <w:t>Способ зависит от того, измеряется ли характеристика количественно.</w:t>
+        <w:t>Формулировки «система работает быстро», «сервис надёжный», «интерфейс удобный» кажутся понятными, пока не начинается приёмка. Тогда выясняется, что заказчик под «быстро» понимал одну секунду, а команда — десять. Спорить не о чем: требование не говорит, что считать выполненным. Поэтому требование к качеству записывают так, чтобы его можно было однозначно проверить.</w:t>
       </w:r>
     </w:p>
     <w:p>
       <w:pPr>
-        <w:keepNext/>
-        <w:spacing w:before="160" w:after="60"/>
+        <w:spacing w:before="0" w:after="120" w:line="276" w:lineRule="auto"/>
+        <w:jc w:val="left"/>
       </w:pPr>
       <w:r>
         <w:rPr>
-          <w:rFonts w:ascii="Times New Roman" w:hAnsi="Times New Roman" w:eastAsia="Times New Roman"/>
+          <w:rFonts w:ascii="Times New Roman" w:hAnsi="Times New Roman"/>
+          <w:b w:val="0"/>
+          <w:i/>
+          <w:sz w:val="24"/>
+        </w:rPr>
+        <w:t>Способ формулирования зависит от того, измеряется ли характеристика количественно.</w:t>
+      </w:r>
+    </w:p>
+    <w:p>
+      <w:pPr>
+        <w:spacing w:before="80" w:after="80" w:line="276" w:lineRule="auto"/>
+        <w:jc w:val="left"/>
+      </w:pPr>
+      <w:r>
+        <w:rPr>
+          <w:rFonts w:ascii="Times New Roman" w:hAnsi="Times New Roman"/>
           <w:b/>
           <w:i w:val="0"/>
           <w:sz w:val="24"/>
         </w:rPr>
-        <w:t>Характеристика измеряется количественно</w:t>
+        <w:t>1. Характеристика измеряется количественно</w:t>
       </w:r>
     </w:p>
     <w:p>
       <w:pPr>
-        <w:spacing w:before="0" w:after="80"/>
-        <w:jc w:val="both"/>
+        <w:spacing w:before="0" w:after="80" w:line="276" w:lineRule="auto"/>
+        <w:jc w:val="left"/>
       </w:pPr>
       <w:r>
         <w:rPr>
-          <w:rFonts w:ascii="Times New Roman" w:hAnsi="Times New Roman" w:eastAsia="Times New Roman"/>
+          <w:rFonts w:ascii="Times New Roman" w:hAnsi="Times New Roman"/>
           <w:b w:val="0"/>
           <w:i w:val="0"/>
+          <w:sz w:val="24"/>
         </w:rPr>
-        <w:t>Задают метрику, целевое значение и условия, при которых значение должно соблюдаться. Условия обязательны: «ответ за 2 секунды» при одном пользователе и при двухстах — это разные требования.</w:t>
+        <w:t>Задают метрику, целевое значение и условия, при которых значение должно соблюдаться. Условия обязательны: «ответ за 1.5 секунды» при одном пользователе и при сотне одновременных гостей — это принципиально разные требования.</w:t>
       </w:r>
     </w:p>
     <w:p>
       <w:pPr>
-        <w:spacing w:before="40" w:after="120"/>
-        <w:ind w:left="340"/>
+        <w:spacing w:before="0" w:after="120" w:line="276" w:lineRule="auto"/>
+        <w:jc w:val="left"/>
       </w:pPr>
       <w:r>
         <w:rPr>
-          <w:rFonts w:ascii="Times New Roman" w:hAnsi="Times New Roman" w:eastAsia="Times New Roman"/>
-          <w:b w:val="0"/>
+          <w:rFonts w:ascii="Times New Roman" w:hAnsi="Times New Roman"/>
+          <w:b/>
+          <w:sz w:val="23"/>
+        </w:rPr>
+        <w:t xml:space="preserve">Пример для проекта «Умный ресторан»: </w:t>
+      </w:r>
+      <w:r>
+        <w:rPr>
+          <w:rFonts w:ascii="Times New Roman" w:hAnsi="Times New Roman"/>
           <w:i/>
-          <w:sz w:val="22"/>
+          <w:sz w:val="23"/>
         </w:rPr>
-        <w:t>Пример: «При 200 одновременно активных клиентах свободные интервалы для записи показываются не дольше 2 секунд для 95% запросов».</w:t>
+        <w:t>«В пятничный вечерний час пик при 100 одновременно активных гостях расчет доступности столов и отображение интерактивной 2D-схемы зала на выбранный интервал времени выполняется не дольше 1.5 секунд для 95% запросов (p95 ≤ 1.5 с) при уровне сетевых ошибок HTTP 5xx менее 0.1%».</w:t>
       </w:r>
     </w:p>
     <w:p>
       <w:pPr>
-        <w:keepNext/>
-        <w:spacing w:before="160" w:after="60"/>
+        <w:spacing w:before="80" w:after="80" w:line="276" w:lineRule="auto"/>
+        <w:jc w:val="left"/>
       </w:pPr>
       <w:r>
         <w:rPr>
-          <w:rFonts w:ascii="Times New Roman" w:hAnsi="Times New Roman" w:eastAsia="Times New Roman"/>
+          <w:rFonts w:ascii="Times New Roman" w:hAnsi="Times New Roman"/>
           <w:b/>
           <w:i w:val="0"/>
           <w:sz w:val="24"/>
         </w:rPr>
-        <w:t>Характеристика не измеряется одним числом</w:t>
+        <w:t>2. Характеристика не измеряется одним числом</w:t>
       </w:r>
     </w:p>
     <w:p>
       <w:pPr>
-        <w:spacing w:before="0" w:after="80"/>
-        <w:jc w:val="both"/>
+        <w:spacing w:before="0" w:after="80" w:line="276" w:lineRule="auto"/>
+        <w:jc w:val="left"/>
       </w:pPr>
       <w:r>
         <w:rPr>
-          <w:rFonts w:ascii="Times New Roman" w:hAnsi="Times New Roman" w:eastAsia="Times New Roman"/>
+          <w:rFonts w:ascii="Times New Roman" w:hAnsi="Times New Roman"/>
           <w:b w:val="0"/>
           <w:i w:val="0"/>
+          <w:sz w:val="24"/>
         </w:rPr>
-        <w:t>Записывают проверяемое правило. Так обычно формулируют требования к защищённости и совместимости. Числа здесь нет, но проверить требование можно однозначно.</w:t>
+        <w:t>Записывают проверяемое правило. Так обычно формулируют требования к защищённости, ролевому разграничению доступа и целостности данных. Числа здесь нет, но проверить требование можно однозначно бинарным критерием (выполнено / не выполнено).</w:t>
       </w:r>
     </w:p>
     <w:p>
       <w:pPr>
-        <w:spacing w:before="40" w:after="120"/>
-        <w:ind w:left="340"/>
+        <w:spacing w:before="0" w:after="80" w:line="276" w:lineRule="auto"/>
+        <w:jc w:val="left"/>
       </w:pPr>
       <w:r>
         <w:rPr>
-          <w:rFonts w:ascii="Times New Roman" w:hAnsi="Times New Roman" w:eastAsia="Times New Roman"/>
-          <w:b w:val="0"/>
+          <w:rFonts w:ascii="Times New Roman" w:hAnsi="Times New Roman"/>
+          <w:b/>
+          <w:sz w:val="23"/>
+        </w:rPr>
+        <w:t xml:space="preserve">Пример 1 (Безопасность и RBAC): </w:t>
+      </w:r>
+      <w:r>
+        <w:rPr>
+          <w:rFonts w:ascii="Times New Roman" w:hAnsi="Times New Roman"/>
           <w:i/>
-          <w:sz w:val="22"/>
+          <w:sz w:val="23"/>
         </w:rPr>
-        <w:t>Пример: «Перечень услуг и цен изменяет только администратор; попытка любого другого пользователя отклоняется и записывается в журнал».</w:t>
+        <w:t>«Создавать, редактировать и публиковать ревизии 2D-схемы залов ресторана имеет право исключительно пользователь с ролью constructor или admin; любая попытка изменения схемы со стороны гостя (guest) или неавторизованного пользователя отклоняется с кодом HTTP 403 Forbidden и записью события в AuditLog».</w:t>
       </w:r>
     </w:p>
     <w:p>
       <w:pPr>
-        <w:keepNext/>
-        <w:spacing w:before="160" w:after="60"/>
+        <w:spacing w:before="0" w:after="120" w:line="276" w:lineRule="auto"/>
+        <w:jc w:val="left"/>
       </w:pPr>
       <w:r>
         <w:rPr>
-          <w:rFonts w:ascii="Times New Roman" w:hAnsi="Times New Roman" w:eastAsia="Times New Roman"/>
+          <w:rFonts w:ascii="Times New Roman" w:hAnsi="Times New Roman"/>
+          <w:b/>
+          <w:sz w:val="23"/>
+        </w:rPr>
+        <w:t xml:space="preserve">Пример 2 (Целостность данных): </w:t>
+      </w:r>
+      <w:r>
+        <w:rPr>
+          <w:rFonts w:ascii="Times New Roman" w:hAnsi="Times New Roman"/>
+          <w:i/>
+          <w:sz w:val="23"/>
+        </w:rPr>
+        <w:t>«Публикация новой ревизии схемы зала блокируется валидатором, если при изменении планировки удаляется стол или уменьшается его вместимость при наличии будущих активных подтвержденных броней (status = confirmed); система возвращает перечень конфликтующих броней и отклоняет сохранение».</w:t>
+      </w:r>
+    </w:p>
+    <w:p>
+      <w:pPr>
+        <w:spacing w:before="80" w:after="80" w:line="276" w:lineRule="auto"/>
+        <w:jc w:val="left"/>
+      </w:pPr>
+      <w:r>
+        <w:rPr>
+          <w:rFonts w:ascii="Times New Roman" w:hAnsi="Times New Roman"/>
           <w:b/>
           <w:i w:val="0"/>
           <w:sz w:val="24"/>
         </w:rPr>
-        <w:t>Как проверяют и что считать выполненным</w:t>
+        <w:t>3. Как проверяют и что считать выполненным</w:t>
       </w:r>
     </w:p>
     <w:p>
       <w:pPr>
-        <w:spacing w:before="0" w:after="80"/>
-        <w:jc w:val="both"/>
+        <w:spacing w:before="0" w:after="80" w:line="276" w:lineRule="auto"/>
+        <w:jc w:val="left"/>
       </w:pPr>
       <w:r>
         <w:rPr>
-          <w:rFonts w:ascii="Times New Roman" w:hAnsi="Times New Roman" w:eastAsia="Times New Roman"/>
+          <w:rFonts w:ascii="Times New Roman" w:hAnsi="Times New Roman"/>
           <w:b w:val="0"/>
           <w:i w:val="0"/>
+          <w:sz w:val="24"/>
         </w:rPr>
-        <w:t>Проверка не всегда означает тест. Время отклика проверяют нагрузочным тестом, доступность за месяц — мониторингом, удобство — наблюдением за пользователями. Во всех случаях заранее договариваются, что считать выполнением: «p95 не больше 2 секунд», «не менее 99,5% за месяц», «не менее 4 из 5 новых клиентов записываются за 3 минуты».</w:t>
+        <w:t>Проверка не всегда означает автоматический юнит-тест. Время отклика проверяют нагрузочным тестированием (k6 / Artillery), защиту от двойных броней — интеграционными тестами транзакций и параллельных запросов (Vitest / Supertest), удобство SVG-конструктора — наблюдением за пользователями (usability test). Во всех случаях заранее договариваются о критериях приемки: «p95 не более 1.5 с», «0 случаев овербукинга при параллельных транзакциях», «время оцифровки зала до 20 минут».</w:t>
       </w:r>
     </w:p>
     <w:p>
       <w:pPr>
-        <w:spacing w:before="0" w:after="80"/>
-        <w:jc w:val="both"/>
+        <w:spacing w:before="0" w:after="160" w:line="276" w:lineRule="auto"/>
+        <w:jc w:val="left"/>
       </w:pPr>
       <w:r>
         <w:rPr>
-          <w:rFonts w:ascii="Times New Roman" w:hAnsi="Times New Roman" w:eastAsia="Times New Roman"/>
+          <w:rFonts w:ascii="Times New Roman" w:hAnsi="Times New Roman"/>
           <w:b w:val="0"/>
-          <w:i w:val="0"/>
+          <w:i/>
+          <w:sz w:val="24"/>
         </w:rPr>
-        <w:t>Если значения взять неоткуда, так и пишут: «значение не установлено, уточнить у заказчика». Придуманное число хуже отсутствующего: на нём потом будет построен выбор хранилища и технологий.</w:t>
+        <w:t>Если значение взять неоткуда, в спецификации фиксируют: «значение не установлено, уточнить у заказчика». Придуманное число хуже отсутствующего, так как на нем строится выбор архитектуры БД и сетевого взаимодействия.</w:t>
       </w:r>
     </w:p>
     <w:p>
       <w:pPr>
-        <w:keepNext/>
-        <w:spacing w:before="160" w:after="60"/>
+        <w:spacing w:before="120" w:after="80" w:line="276" w:lineRule="auto"/>
+        <w:jc w:val="left"/>
       </w:pPr>
       <w:r>
         <w:rPr>
-          <w:rFonts w:ascii="Times New Roman" w:hAnsi="Times New Roman" w:eastAsia="Times New Roman"/>
+          <w:rFonts w:ascii="Times New Roman" w:hAnsi="Times New Roman"/>
           <w:b/>
           <w:i w:val="0"/>
-          <w:sz w:val="24"/>
+          <w:sz w:val="26"/>
         </w:rPr>
-        <w:t>Сценарий атрибута качества</w:t>
+        <w:t>4. Сценарии атрибутов качества по проекту (модель Bass, Clements, Kazman)</w:t>
       </w:r>
     </w:p>
     <w:p>
       <w:pPr>
-        <w:spacing w:before="0" w:after="80"/>
-        <w:jc w:val="both"/>
+        <w:spacing w:before="0" w:after="120" w:line="276" w:lineRule="auto"/>
+        <w:jc w:val="left"/>
       </w:pPr>
       <w:r>
         <w:rPr>
-          <w:rFonts w:ascii="Times New Roman" w:hAnsi="Times New Roman" w:eastAsia="Times New Roman"/>
+          <w:rFonts w:ascii="Times New Roman" w:hAnsi="Times New Roman"/>
           <w:b w:val="0"/>
           <w:i w:val="0"/>
+          <w:sz w:val="24"/>
         </w:rPr>
-        <w:t>Для главных атрибутов качества удобно сначала разложить ситуацию на шесть частей — так называемый сценарий атрибута качества (L. Bass, P. Clements, R. Kazman):</w:t>
+        <w:t>Для ключевых атрибутов качества ситуация раскладывается на 6 структурированных компонентов: Источник, Стимул, Среда, Артефакт, Отклик и Мера отклика. Из сценария собирается итоговая проверяемая формулировка требования для технического задания и приемочного тестирования.</w:t>
       </w:r>
     </w:p>
     <w:tbl>
       <w:tblPr>
         <w:tblW w:type="auto" w:w="0"/>
         <w:jc w:val="center"/>
-        <w:tblLayout w:type="fixed"/>
         <w:tblLook w:firstColumn="1" w:firstRow="1" w:lastColumn="0" w:lastRow="0" w:noHBand="0" w:noVBand="1" w:val="04A0"/>
-        <w:tblBorders>
-          <w:top w:val="single" w:sz="6" w:space="0" w:color="000000"/>
-          <w:left w:val="single" w:sz="6" w:space="0" w:color="000000"/>
-          <w:bottom w:val="single" w:sz="6" w:space="0" w:color="000000"/>
-          <w:right w:val="single" w:sz="6" w:space="0" w:color="000000"/>
-          <w:insideH w:val="single" w:sz="6" w:space="0" w:color="000000"/>
-          <w:insideV w:val="single" w:sz="6" w:space="0" w:color="000000"/>
-        </w:tblBorders>
-        <w:tblLayout w:type="fixed"/>
       </w:tblPr>
       <w:tblGrid>
-        <w:gridCol w:w="1928"/>
-        <w:gridCol w:w="3515"/>
-        <w:gridCol w:w="4196"/>
+        <w:gridCol w:w="1872"/>
+        <w:gridCol w:w="1872"/>
+        <w:gridCol w:w="1872"/>
+        <w:gridCol w:w="1872"/>
+        <w:gridCol w:w="1872"/>
       </w:tblGrid>
       <w:tr>
-        <w:trPr>
-          <w:cantSplit/>
-          <w:tblHeader/>
-        </w:trPr>
         <w:tc>
           <w:tcPr>
-            <w:tcW w:type="dxa" w:w="1928"/>
-            <w:shd w:val="clear" w:color="auto" w:fill="E7E6E6"/>
+            <w:tcW w:type="dxa" w:w="1872"/>
+            <w:tcMar>
+              <w:top w:w="80" w:type="dxa"/>
+              <w:bottom w:w="80" w:type="dxa"/>
+              <w:left w:w="80" w:type="dxa"/>
+              <w:right w:w="80" w:type="dxa"/>
+            </w:tcMar>
+            <w:shd w:fill="EAECEF"/>
           </w:tcPr>
           <w:p>
             <w:pPr>
-              <w:keepNext/>
-              <w:spacing w:after="0" w:line="240" w:lineRule="auto"/>
+              <w:jc w:val="center"/>
             </w:pPr>
-            <w:r/>
             <w:r>
               <w:rPr>
-                <w:rFonts w:ascii="Times New Roman" w:hAnsi="Times New Roman" w:eastAsia="Times New Roman"/>
+                <w:rFonts w:ascii="Times New Roman" w:hAnsi="Times New Roman"/>
                 <w:b/>
-                <w:i w:val="0"/>
-                <w:sz w:val="22"/>
+                <w:sz w:val="19"/>
               </w:rPr>
-              <w:t>Часть</w:t>
+              <w:t>Часть сценария</w:t>
             </w:r>
           </w:p>
         </w:tc>
         <w:tc>
           <w:tcPr>
-            <w:tcW w:type="dxa" w:w="3515"/>
-            <w:shd w:val="clear" w:color="auto" w:fill="E7E6E6"/>
+            <w:tcW w:type="dxa" w:w="1872"/>
+            <w:tcMar>
+              <w:top w:w="80" w:type="dxa"/>
+              <w:bottom w:w="80" w:type="dxa"/>
+              <w:left w:w="80" w:type="dxa"/>
+              <w:right w:w="80" w:type="dxa"/>
+            </w:tcMar>
+            <w:shd w:fill="EAECEF"/>
           </w:tcPr>
           <w:p>
             <w:pPr>
-              <w:keepNext/>
-              <w:spacing w:after="0" w:line="240" w:lineRule="auto"/>
+              <w:jc w:val="center"/>
             </w:pPr>
-            <w:r/>
             <w:r>
               <w:rPr>
-                <w:rFonts w:ascii="Times New Roman" w:hAnsi="Times New Roman" w:eastAsia="Times New Roman"/>
+                <w:rFonts w:ascii="Times New Roman" w:hAnsi="Times New Roman"/>
                 <w:b/>
-                <w:i w:val="0"/>
-                <w:sz w:val="22"/>
+                <w:sz w:val="19"/>
               </w:rPr>
-              <w:t>Вопрос</w:t>
+              <w:t>Сценарий 1: Производительность (Latency)</w:t>
             </w:r>
           </w:p>
         </w:tc>
         <w:tc>
           <w:tcPr>
-            <w:tcW w:type="dxa" w:w="4195"/>
-            <w:shd w:val="clear" w:color="auto" w:fill="E7E6E6"/>
+            <w:tcW w:type="dxa" w:w="1872"/>
+            <w:tcMar>
+              <w:top w:w="80" w:type="dxa"/>
+              <w:bottom w:w="80" w:type="dxa"/>
+              <w:left w:w="80" w:type="dxa"/>
+              <w:right w:w="80" w:type="dxa"/>
+            </w:tcMar>
+            <w:shd w:fill="EAECEF"/>
           </w:tcPr>
           <w:p>
             <w:pPr>
-              <w:keepNext/>
-              <w:spacing w:after="0" w:line="240" w:lineRule="auto"/>
+              <w:jc w:val="center"/>
             </w:pPr>
-            <w:r/>
             <w:r>
               <w:rPr>
-                <w:rFonts w:ascii="Times New Roman" w:hAnsi="Times New Roman" w:eastAsia="Times New Roman"/>
+                <w:rFonts w:ascii="Times New Roman" w:hAnsi="Times New Roman"/>
                 <w:b/>
-                <w:i w:val="0"/>
-                <w:sz w:val="22"/>
+                <w:sz w:val="19"/>
               </w:rPr>
-              <w:t>Пример</w:t>
+              <w:t>Сценарий 2: Надежность (No Overbooking)</w:t>
+            </w:r>
+          </w:p>
+        </w:tc>
+        <w:tc>
+          <w:tcPr>
+            <w:tcW w:type="dxa" w:w="1872"/>
+            <w:tcMar>
+              <w:top w:w="80" w:type="dxa"/>
+              <w:bottom w:w="80" w:type="dxa"/>
+              <w:left w:w="80" w:type="dxa"/>
+              <w:right w:w="80" w:type="dxa"/>
+            </w:tcMar>
+            <w:shd w:fill="EAECEF"/>
+          </w:tcPr>
+          <w:p>
+            <w:pPr>
+              <w:jc w:val="center"/>
+            </w:pPr>
+            <w:r>
+              <w:rPr>
+                <w:rFonts w:ascii="Times New Roman" w:hAnsi="Times New Roman"/>
+                <w:b/>
+                <w:sz w:val="19"/>
+              </w:rPr>
+              <w:t>Сценарий 3: Целостность (Layout Safety)</w:t>
+            </w:r>
+          </w:p>
+        </w:tc>
+        <w:tc>
+          <w:tcPr>
+            <w:tcW w:type="dxa" w:w="1872"/>
+            <w:tcMar>
+              <w:top w:w="80" w:type="dxa"/>
+              <w:bottom w:w="80" w:type="dxa"/>
+              <w:left w:w="80" w:type="dxa"/>
+              <w:right w:w="80" w:type="dxa"/>
+            </w:tcMar>
+            <w:shd w:fill="EAECEF"/>
+          </w:tcPr>
+          <w:p>
+            <w:pPr>
+              <w:jc w:val="center"/>
+            </w:pPr>
+            <w:r>
+              <w:rPr>
+                <w:rFonts w:ascii="Times New Roman" w:hAnsi="Times New Roman"/>
+                <w:b/>
+                <w:sz w:val="19"/>
+              </w:rPr>
+              <w:t>Сценарий 4: Отзывчивость UI (2D Constructor)</w:t>
             </w:r>
           </w:p>
         </w:tc>
       </w:tr>
       <w:tr>
-        <w:trPr>
-          <w:cantSplit/>
-        </w:trPr>
         <w:tc>
           <w:tcPr>
-            <w:tcW w:type="dxa" w:w="1928"/>
+            <w:tcW w:type="dxa" w:w="1872"/>
+            <w:tcMar>
+              <w:top w:w="60" w:type="dxa"/>
+              <w:bottom w:w="60" w:type="dxa"/>
+              <w:left w:w="70" w:type="dxa"/>
+              <w:right w:w="70" w:type="dxa"/>
+            </w:tcMar>
+            <w:shd w:fill="F4F5F7"/>
           </w:tcPr>
           <w:p>
             <w:pPr>
-              <w:keepNext/>
-              <w:spacing w:after="0" w:line="240" w:lineRule="auto"/>
+              <w:spacing w:line="252" w:lineRule="auto" w:before="20" w:after="20"/>
             </w:pPr>
-            <w:r/>
             <w:r>
               <w:rPr>
-                <w:rFonts w:ascii="Times New Roman" w:hAnsi="Times New Roman" w:eastAsia="Times New Roman"/>
-                <w:b w:val="0"/>
-                <w:i w:val="0"/>
-                <w:sz w:val="22"/>
+                <w:rFonts w:ascii="Times New Roman" w:hAnsi="Times New Roman"/>
+                <w:b/>
+                <w:sz w:val="18"/>
               </w:rPr>
               <w:t>Источник</w:t>
             </w:r>
@@ -370,67 +513,118 @@
         </w:tc>
         <w:tc>
           <w:tcPr>
-            <w:tcW w:type="dxa" w:w="3515"/>
+            <w:tcW w:type="dxa" w:w="1872"/>
+            <w:tcMar>
+              <w:top w:w="60" w:type="dxa"/>
+              <w:bottom w:w="60" w:type="dxa"/>
+              <w:left w:w="70" w:type="dxa"/>
+              <w:right w:w="70" w:type="dxa"/>
+            </w:tcMar>
           </w:tcPr>
           <w:p>
             <w:pPr>
-              <w:keepNext/>
-              <w:spacing w:after="0" w:line="240" w:lineRule="auto"/>
+              <w:spacing w:line="252" w:lineRule="auto" w:before="20" w:after="20"/>
             </w:pPr>
-            <w:r/>
             <w:r>
               <w:rPr>
-                <w:rFonts w:ascii="Times New Roman" w:hAnsi="Times New Roman" w:eastAsia="Times New Roman"/>
-                <w:b w:val="0"/>
-                <w:i w:val="0"/>
-                <w:sz w:val="22"/>
+                <w:rFonts w:ascii="Times New Roman" w:hAnsi="Times New Roman"/>
+                <w:sz w:val="18"/>
               </w:rPr>
-              <w:t>Кто или что вызывает событие?</w:t>
+              <w:t>Гости ресторана (веб-клиенты)</w:t>
             </w:r>
           </w:p>
         </w:tc>
         <w:tc>
           <w:tcPr>
-            <w:tcW w:type="dxa" w:w="4195"/>
+            <w:tcW w:type="dxa" w:w="1872"/>
+            <w:tcMar>
+              <w:top w:w="60" w:type="dxa"/>
+              <w:bottom w:w="60" w:type="dxa"/>
+              <w:left w:w="70" w:type="dxa"/>
+              <w:right w:w="70" w:type="dxa"/>
+            </w:tcMar>
           </w:tcPr>
           <w:p>
             <w:pPr>
-              <w:keepNext/>
-              <w:spacing w:after="0" w:line="240" w:lineRule="auto"/>
+              <w:spacing w:line="252" w:lineRule="auto" w:before="20" w:after="20"/>
             </w:pPr>
-            <w:r/>
             <w:r>
               <w:rPr>
-                <w:rFonts w:ascii="Times New Roman" w:hAnsi="Times New Roman" w:eastAsia="Times New Roman"/>
-                <w:b w:val="0"/>
-                <w:i w:val="0"/>
-                <w:sz w:val="22"/>
+                <w:rFonts w:ascii="Times New Roman" w:hAnsi="Times New Roman"/>
+                <w:sz w:val="18"/>
               </w:rPr>
-              <w:t>Клиенты автосервиса</w:t>
+              <w:t>Два или более гостя одновременно</w:t>
+            </w:r>
+          </w:p>
+        </w:tc>
+        <w:tc>
+          <w:tcPr>
+            <w:tcW w:type="dxa" w:w="1872"/>
+            <w:tcMar>
+              <w:top w:w="60" w:type="dxa"/>
+              <w:bottom w:w="60" w:type="dxa"/>
+              <w:left w:w="70" w:type="dxa"/>
+              <w:right w:w="70" w:type="dxa"/>
+            </w:tcMar>
+          </w:tcPr>
+          <w:p>
+            <w:pPr>
+              <w:spacing w:line="252" w:lineRule="auto" w:before="20" w:after="20"/>
+            </w:pPr>
+            <w:r>
+              <w:rPr>
+                <w:rFonts w:ascii="Times New Roman" w:hAnsi="Times New Roman"/>
+                <w:sz w:val="18"/>
+              </w:rPr>
+              <w:t>Конструктор / администратор</w:t>
+            </w:r>
+          </w:p>
+        </w:tc>
+        <w:tc>
+          <w:tcPr>
+            <w:tcW w:type="dxa" w:w="1872"/>
+            <w:tcMar>
+              <w:top w:w="60" w:type="dxa"/>
+              <w:bottom w:w="60" w:type="dxa"/>
+              <w:left w:w="70" w:type="dxa"/>
+              <w:right w:w="70" w:type="dxa"/>
+            </w:tcMar>
+          </w:tcPr>
+          <w:p>
+            <w:pPr>
+              <w:spacing w:line="252" w:lineRule="auto" w:before="20" w:after="20"/>
+            </w:pPr>
+            <w:r>
+              <w:rPr>
+                <w:rFonts w:ascii="Times New Roman" w:hAnsi="Times New Roman"/>
+                <w:sz w:val="18"/>
+              </w:rPr>
+              <w:t>Пользователь-конструктор схем</w:t>
             </w:r>
           </w:p>
         </w:tc>
       </w:tr>
       <w:tr>
-        <w:trPr>
-          <w:cantSplit/>
-        </w:trPr>
         <w:tc>
           <w:tcPr>
-            <w:tcW w:type="dxa" w:w="1928"/>
+            <w:tcW w:type="dxa" w:w="1872"/>
+            <w:tcMar>
+              <w:top w:w="60" w:type="dxa"/>
+              <w:bottom w:w="60" w:type="dxa"/>
+              <w:left w:w="70" w:type="dxa"/>
+              <w:right w:w="70" w:type="dxa"/>
+            </w:tcMar>
+            <w:shd w:fill="F4F5F7"/>
           </w:tcPr>
           <w:p>
             <w:pPr>
-              <w:keepNext/>
-              <w:spacing w:after="0" w:line="240" w:lineRule="auto"/>
+              <w:spacing w:line="252" w:lineRule="auto" w:before="20" w:after="20"/>
             </w:pPr>
-            <w:r/>
             <w:r>
               <w:rPr>
-                <w:rFonts w:ascii="Times New Roman" w:hAnsi="Times New Roman" w:eastAsia="Times New Roman"/>
-                <w:b w:val="0"/>
-                <w:i w:val="0"/>
-                <w:sz w:val="22"/>
+                <w:rFonts w:ascii="Times New Roman" w:hAnsi="Times New Roman"/>
+                <w:b/>
+                <w:sz w:val="18"/>
               </w:rPr>
               <w:t>Стимул</w:t>
             </w:r>
@@ -438,67 +632,118 @@
         </w:tc>
         <w:tc>
           <w:tcPr>
-            <w:tcW w:type="dxa" w:w="3515"/>
+            <w:tcW w:type="dxa" w:w="1872"/>
+            <w:tcMar>
+              <w:top w:w="60" w:type="dxa"/>
+              <w:bottom w:w="60" w:type="dxa"/>
+              <w:left w:w="70" w:type="dxa"/>
+              <w:right w:w="70" w:type="dxa"/>
+            </w:tcMar>
           </w:tcPr>
           <w:p>
             <w:pPr>
-              <w:keepNext/>
-              <w:spacing w:after="0" w:line="240" w:lineRule="auto"/>
+              <w:spacing w:line="252" w:lineRule="auto" w:before="20" w:after="20"/>
             </w:pPr>
-            <w:r/>
             <w:r>
               <w:rPr>
-                <w:rFonts w:ascii="Times New Roman" w:hAnsi="Times New Roman" w:eastAsia="Times New Roman"/>
-                <w:b w:val="0"/>
-                <w:i w:val="0"/>
-                <w:sz w:val="22"/>
+                <w:rFonts w:ascii="Times New Roman" w:hAnsi="Times New Roman"/>
+                <w:sz w:val="18"/>
               </w:rPr>
-              <w:t>Что происходит?</w:t>
+              <w:t>Одновременный запрос доступности столов на интерактивной карте зала</w:t>
             </w:r>
           </w:p>
         </w:tc>
         <w:tc>
           <w:tcPr>
-            <w:tcW w:type="dxa" w:w="4195"/>
+            <w:tcW w:type="dxa" w:w="1872"/>
+            <w:tcMar>
+              <w:top w:w="60" w:type="dxa"/>
+              <w:bottom w:w="60" w:type="dxa"/>
+              <w:left w:w="70" w:type="dxa"/>
+              <w:right w:w="70" w:type="dxa"/>
+            </w:tcMar>
           </w:tcPr>
           <w:p>
             <w:pPr>
-              <w:keepNext/>
-              <w:spacing w:after="0" w:line="240" w:lineRule="auto"/>
+              <w:spacing w:line="252" w:lineRule="auto" w:before="20" w:after="20"/>
             </w:pPr>
-            <w:r/>
             <w:r>
               <w:rPr>
-                <w:rFonts w:ascii="Times New Roman" w:hAnsi="Times New Roman" w:eastAsia="Times New Roman"/>
-                <w:b w:val="0"/>
-                <w:i w:val="0"/>
-                <w:sz w:val="22"/>
+                <w:rFonts w:ascii="Times New Roman" w:hAnsi="Times New Roman"/>
+                <w:sz w:val="18"/>
               </w:rPr>
-              <w:t>Одновременно запрашивают свободное время</w:t>
+              <w:t>Одновременная попытка забронировать один и тот же стол на пересекающийся слот</w:t>
+            </w:r>
+          </w:p>
+        </w:tc>
+        <w:tc>
+          <w:tcPr>
+            <w:tcW w:type="dxa" w:w="1872"/>
+            <w:tcMar>
+              <w:top w:w="60" w:type="dxa"/>
+              <w:bottom w:w="60" w:type="dxa"/>
+              <w:left w:w="70" w:type="dxa"/>
+              <w:right w:w="70" w:type="dxa"/>
+            </w:tcMar>
+          </w:tcPr>
+          <w:p>
+            <w:pPr>
+              <w:spacing w:line="252" w:lineRule="auto" w:before="20" w:after="20"/>
+            </w:pPr>
+            <w:r>
+              <w:rPr>
+                <w:rFonts w:ascii="Times New Roman" w:hAnsi="Times New Roman"/>
+                <w:sz w:val="18"/>
+              </w:rPr>
+              <w:t>Попытка опубликовать ревизию схемы с удалением столов</w:t>
+            </w:r>
+          </w:p>
+        </w:tc>
+        <w:tc>
+          <w:tcPr>
+            <w:tcW w:type="dxa" w:w="1872"/>
+            <w:tcMar>
+              <w:top w:w="60" w:type="dxa"/>
+              <w:bottom w:w="60" w:type="dxa"/>
+              <w:left w:w="70" w:type="dxa"/>
+              <w:right w:w="70" w:type="dxa"/>
+            </w:tcMar>
+          </w:tcPr>
+          <w:p>
+            <w:pPr>
+              <w:spacing w:line="252" w:lineRule="auto" w:before="20" w:after="20"/>
+            </w:pPr>
+            <w:r>
+              <w:rPr>
+                <w:rFonts w:ascii="Times New Roman" w:hAnsi="Times New Roman"/>
+                <w:sz w:val="18"/>
+              </w:rPr>
+              <w:t>Манипуляции со столами и зонами (drag-and-drop, вращение, масштабирование)</w:t>
             </w:r>
           </w:p>
         </w:tc>
       </w:tr>
       <w:tr>
-        <w:trPr>
-          <w:cantSplit/>
-        </w:trPr>
         <w:tc>
           <w:tcPr>
-            <w:tcW w:type="dxa" w:w="1928"/>
+            <w:tcW w:type="dxa" w:w="1872"/>
+            <w:tcMar>
+              <w:top w:w="60" w:type="dxa"/>
+              <w:bottom w:w="60" w:type="dxa"/>
+              <w:left w:w="70" w:type="dxa"/>
+              <w:right w:w="70" w:type="dxa"/>
+            </w:tcMar>
+            <w:shd w:fill="F4F5F7"/>
           </w:tcPr>
           <w:p>
             <w:pPr>
-              <w:keepNext/>
-              <w:spacing w:after="0" w:line="240" w:lineRule="auto"/>
+              <w:spacing w:line="252" w:lineRule="auto" w:before="20" w:after="20"/>
             </w:pPr>
-            <w:r/>
             <w:r>
               <w:rPr>
-                <w:rFonts w:ascii="Times New Roman" w:hAnsi="Times New Roman" w:eastAsia="Times New Roman"/>
-                <w:b w:val="0"/>
-                <w:i w:val="0"/>
-                <w:sz w:val="22"/>
+                <w:rFonts w:ascii="Times New Roman" w:hAnsi="Times New Roman"/>
+                <w:b/>
+                <w:sz w:val="18"/>
               </w:rPr>
               <w:t>Среда</w:t>
             </w:r>
@@ -506,67 +751,118 @@
         </w:tc>
         <w:tc>
           <w:tcPr>
-            <w:tcW w:type="dxa" w:w="3515"/>
+            <w:tcW w:type="dxa" w:w="1872"/>
+            <w:tcMar>
+              <w:top w:w="60" w:type="dxa"/>
+              <w:bottom w:w="60" w:type="dxa"/>
+              <w:left w:w="70" w:type="dxa"/>
+              <w:right w:w="70" w:type="dxa"/>
+            </w:tcMar>
           </w:tcPr>
           <w:p>
             <w:pPr>
-              <w:keepNext/>
-              <w:spacing w:after="0" w:line="240" w:lineRule="auto"/>
+              <w:spacing w:line="252" w:lineRule="auto" w:before="20" w:after="20"/>
             </w:pPr>
-            <w:r/>
             <w:r>
               <w:rPr>
-                <w:rFonts w:ascii="Times New Roman" w:hAnsi="Times New Roman" w:eastAsia="Times New Roman"/>
-                <w:b w:val="0"/>
-                <w:i w:val="0"/>
-                <w:sz w:val="22"/>
+                <w:rFonts w:ascii="Times New Roman" w:hAnsi="Times New Roman"/>
+                <w:sz w:val="18"/>
               </w:rPr>
-              <w:t>При каких условиях?</w:t>
+              <w:t>Вечерний час наибольшей нагрузки (100 одновременных пользователей)</w:t>
             </w:r>
           </w:p>
         </w:tc>
         <w:tc>
           <w:tcPr>
-            <w:tcW w:type="dxa" w:w="4195"/>
+            <w:tcW w:type="dxa" w:w="1872"/>
+            <w:tcMar>
+              <w:top w:w="60" w:type="dxa"/>
+              <w:bottom w:w="60" w:type="dxa"/>
+              <w:left w:w="70" w:type="dxa"/>
+              <w:right w:w="70" w:type="dxa"/>
+            </w:tcMar>
           </w:tcPr>
           <w:p>
             <w:pPr>
-              <w:keepNext/>
-              <w:spacing w:after="0" w:line="240" w:lineRule="auto"/>
+              <w:spacing w:line="252" w:lineRule="auto" w:before="20" w:after="20"/>
             </w:pPr>
-            <w:r/>
             <w:r>
               <w:rPr>
-                <w:rFonts w:ascii="Times New Roman" w:hAnsi="Times New Roman" w:eastAsia="Times New Roman"/>
-                <w:b w:val="0"/>
-                <w:i w:val="0"/>
-                <w:sz w:val="22"/>
+                <w:rFonts w:ascii="Times New Roman" w:hAnsi="Times New Roman"/>
+                <w:sz w:val="18"/>
               </w:rPr>
-              <w:t>Час наибольшей записи</w:t>
+              <w:t>Штатный режим работы сервиса онлайн-бронирования</w:t>
+            </w:r>
+          </w:p>
+        </w:tc>
+        <w:tc>
+          <w:tcPr>
+            <w:tcW w:type="dxa" w:w="1872"/>
+            <w:tcMar>
+              <w:top w:w="60" w:type="dxa"/>
+              <w:bottom w:w="60" w:type="dxa"/>
+              <w:left w:w="70" w:type="dxa"/>
+              <w:right w:w="70" w:type="dxa"/>
+            </w:tcMar>
+          </w:tcPr>
+          <w:p>
+            <w:pPr>
+              <w:spacing w:line="252" w:lineRule="auto" w:before="20" w:after="20"/>
+            </w:pPr>
+            <w:r>
+              <w:rPr>
+                <w:rFonts w:ascii="Times New Roman" w:hAnsi="Times New Roman"/>
+                <w:sz w:val="18"/>
+              </w:rPr>
+              <w:t>Наличие в БД будущих подтвержденных броней на удаляемые столы</w:t>
+            </w:r>
+          </w:p>
+        </w:tc>
+        <w:tc>
+          <w:tcPr>
+            <w:tcW w:type="dxa" w:w="1872"/>
+            <w:tcMar>
+              <w:top w:w="60" w:type="dxa"/>
+              <w:bottom w:w="60" w:type="dxa"/>
+              <w:left w:w="70" w:type="dxa"/>
+              <w:right w:w="70" w:type="dxa"/>
+            </w:tcMar>
+          </w:tcPr>
+          <w:p>
+            <w:pPr>
+              <w:spacing w:line="252" w:lineRule="auto" w:before="20" w:after="20"/>
+            </w:pPr>
+            <w:r>
+              <w:rPr>
+                <w:rFonts w:ascii="Times New Roman" w:hAnsi="Times New Roman"/>
+                <w:sz w:val="18"/>
+              </w:rPr>
+              <w:t>Браузер клиента, холст SVG со сложной геометрией (50+ столов, полигоны зон)</w:t>
             </w:r>
           </w:p>
         </w:tc>
       </w:tr>
       <w:tr>
-        <w:trPr>
-          <w:cantSplit/>
-        </w:trPr>
         <w:tc>
           <w:tcPr>
-            <w:tcW w:type="dxa" w:w="1928"/>
+            <w:tcW w:type="dxa" w:w="1872"/>
+            <w:tcMar>
+              <w:top w:w="60" w:type="dxa"/>
+              <w:bottom w:w="60" w:type="dxa"/>
+              <w:left w:w="70" w:type="dxa"/>
+              <w:right w:w="70" w:type="dxa"/>
+            </w:tcMar>
+            <w:shd w:fill="F4F5F7"/>
           </w:tcPr>
           <w:p>
             <w:pPr>
-              <w:keepNext/>
-              <w:spacing w:after="0" w:line="240" w:lineRule="auto"/>
+              <w:spacing w:line="252" w:lineRule="auto" w:before="20" w:after="20"/>
             </w:pPr>
-            <w:r/>
             <w:r>
               <w:rPr>
-                <w:rFonts w:ascii="Times New Roman" w:hAnsi="Times New Roman" w:eastAsia="Times New Roman"/>
-                <w:b w:val="0"/>
-                <w:i w:val="0"/>
-                <w:sz w:val="22"/>
+                <w:rFonts w:ascii="Times New Roman" w:hAnsi="Times New Roman"/>
+                <w:b/>
+                <w:sz w:val="18"/>
               </w:rPr>
               <w:t>Артефакт</w:t>
             </w:r>
@@ -574,67 +870,118 @@
         </w:tc>
         <w:tc>
           <w:tcPr>
-            <w:tcW w:type="dxa" w:w="3515"/>
+            <w:tcW w:type="dxa" w:w="1872"/>
+            <w:tcMar>
+              <w:top w:w="60" w:type="dxa"/>
+              <w:bottom w:w="60" w:type="dxa"/>
+              <w:left w:w="70" w:type="dxa"/>
+              <w:right w:w="70" w:type="dxa"/>
+            </w:tcMar>
           </w:tcPr>
           <w:p>
             <w:pPr>
-              <w:keepNext/>
-              <w:spacing w:after="0" w:line="240" w:lineRule="auto"/>
+              <w:spacing w:line="252" w:lineRule="auto" w:before="20" w:after="20"/>
             </w:pPr>
-            <w:r/>
             <w:r>
               <w:rPr>
-                <w:rFonts w:ascii="Times New Roman" w:hAnsi="Times New Roman" w:eastAsia="Times New Roman"/>
-                <w:b w:val="0"/>
-                <w:i w:val="0"/>
-                <w:sz w:val="22"/>
+                <w:rFonts w:ascii="Times New Roman" w:hAnsi="Times New Roman"/>
+                <w:sz w:val="18"/>
               </w:rPr>
-              <w:t>Какая часть системы затронута?</w:t>
+              <w:t>Сервис бронирования (модуль booking) и БД PostgreSQL</w:t>
             </w:r>
           </w:p>
         </w:tc>
         <w:tc>
           <w:tcPr>
-            <w:tcW w:type="dxa" w:w="4195"/>
+            <w:tcW w:type="dxa" w:w="1872"/>
+            <w:tcMar>
+              <w:top w:w="60" w:type="dxa"/>
+              <w:bottom w:w="60" w:type="dxa"/>
+              <w:left w:w="70" w:type="dxa"/>
+              <w:right w:w="70" w:type="dxa"/>
+            </w:tcMar>
           </w:tcPr>
           <w:p>
             <w:pPr>
-              <w:keepNext/>
-              <w:spacing w:after="0" w:line="240" w:lineRule="auto"/>
+              <w:spacing w:line="252" w:lineRule="auto" w:before="20" w:after="20"/>
             </w:pPr>
-            <w:r/>
             <w:r>
               <w:rPr>
-                <w:rFonts w:ascii="Times New Roman" w:hAnsi="Times New Roman" w:eastAsia="Times New Roman"/>
-                <w:b w:val="0"/>
-                <w:i w:val="0"/>
-                <w:sz w:val="22"/>
+                <w:rFonts w:ascii="Times New Roman" w:hAnsi="Times New Roman"/>
+                <w:sz w:val="18"/>
               </w:rPr>
-              <w:t>Сервис записи</w:t>
+              <w:t>Транзакционный модуль бронирования и таблица Reservation</w:t>
+            </w:r>
+          </w:p>
+        </w:tc>
+        <w:tc>
+          <w:tcPr>
+            <w:tcW w:type="dxa" w:w="1872"/>
+            <w:tcMar>
+              <w:top w:w="60" w:type="dxa"/>
+              <w:bottom w:w="60" w:type="dxa"/>
+              <w:left w:w="70" w:type="dxa"/>
+              <w:right w:w="70" w:type="dxa"/>
+            </w:tcMar>
+          </w:tcPr>
+          <w:p>
+            <w:pPr>
+              <w:spacing w:line="252" w:lineRule="auto" w:before="20" w:after="20"/>
+            </w:pPr>
+            <w:r>
+              <w:rPr>
+                <w:rFonts w:ascii="Times New Roman" w:hAnsi="Times New Roman"/>
+                <w:sz w:val="18"/>
+              </w:rPr>
+              <w:t>Модуль layout (валидатор ревизий) и API публикации схемы</w:t>
+            </w:r>
+          </w:p>
+        </w:tc>
+        <w:tc>
+          <w:tcPr>
+            <w:tcW w:type="dxa" w:w="1872"/>
+            <w:tcMar>
+              <w:top w:w="60" w:type="dxa"/>
+              <w:bottom w:w="60" w:type="dxa"/>
+              <w:left w:w="70" w:type="dxa"/>
+              <w:right w:w="70" w:type="dxa"/>
+            </w:tcMar>
+          </w:tcPr>
+          <w:p>
+            <w:pPr>
+              <w:spacing w:line="252" w:lineRule="auto" w:before="20" w:after="20"/>
+            </w:pPr>
+            <w:r>
+              <w:rPr>
+                <w:rFonts w:ascii="Times New Roman" w:hAnsi="Times New Roman"/>
+                <w:sz w:val="18"/>
+              </w:rPr>
+              <w:t>Клиентский SVG-компонент &lt;FloorPlanSVG&gt;</w:t>
             </w:r>
           </w:p>
         </w:tc>
       </w:tr>
       <w:tr>
-        <w:trPr>
-          <w:cantSplit/>
-        </w:trPr>
         <w:tc>
           <w:tcPr>
-            <w:tcW w:type="dxa" w:w="1928"/>
+            <w:tcW w:type="dxa" w:w="1872"/>
+            <w:tcMar>
+              <w:top w:w="60" w:type="dxa"/>
+              <w:bottom w:w="60" w:type="dxa"/>
+              <w:left w:w="70" w:type="dxa"/>
+              <w:right w:w="70" w:type="dxa"/>
+            </w:tcMar>
+            <w:shd w:fill="F4F5F7"/>
           </w:tcPr>
           <w:p>
             <w:pPr>
-              <w:keepNext/>
-              <w:spacing w:after="0" w:line="240" w:lineRule="auto"/>
+              <w:spacing w:line="252" w:lineRule="auto" w:before="20" w:after="20"/>
             </w:pPr>
-            <w:r/>
             <w:r>
               <w:rPr>
-                <w:rFonts w:ascii="Times New Roman" w:hAnsi="Times New Roman" w:eastAsia="Times New Roman"/>
-                <w:b w:val="0"/>
-                <w:i w:val="0"/>
-                <w:sz w:val="22"/>
+                <w:rFonts w:ascii="Times New Roman" w:hAnsi="Times New Roman"/>
+                <w:b/>
+                <w:sz w:val="18"/>
               </w:rPr>
               <w:t>Отклик</w:t>
             </w:r>
@@ -642,67 +989,118 @@
         </w:tc>
         <w:tc>
           <w:tcPr>
-            <w:tcW w:type="dxa" w:w="3515"/>
+            <w:tcW w:type="dxa" w:w="1872"/>
+            <w:tcMar>
+              <w:top w:w="60" w:type="dxa"/>
+              <w:bottom w:w="60" w:type="dxa"/>
+              <w:left w:w="70" w:type="dxa"/>
+              <w:right w:w="70" w:type="dxa"/>
+            </w:tcMar>
           </w:tcPr>
           <w:p>
             <w:pPr>
-              <w:keepNext/>
-              <w:spacing w:after="0" w:line="240" w:lineRule="auto"/>
+              <w:spacing w:line="252" w:lineRule="auto" w:before="20" w:after="20"/>
             </w:pPr>
-            <w:r/>
             <w:r>
               <w:rPr>
-                <w:rFonts w:ascii="Times New Roman" w:hAnsi="Times New Roman" w:eastAsia="Times New Roman"/>
-                <w:b w:val="0"/>
-                <w:i w:val="0"/>
-                <w:sz w:val="22"/>
+                <w:rFonts w:ascii="Times New Roman" w:hAnsi="Times New Roman"/>
+                <w:sz w:val="18"/>
               </w:rPr>
-              <w:t>Что делает система?</w:t>
+              <w:t>Вычисление занятости столов с учетом буфера 15 мин и отдача SVG-карты</w:t>
             </w:r>
           </w:p>
         </w:tc>
         <w:tc>
           <w:tcPr>
-            <w:tcW w:type="dxa" w:w="4195"/>
+            <w:tcW w:type="dxa" w:w="1872"/>
+            <w:tcMar>
+              <w:top w:w="60" w:type="dxa"/>
+              <w:bottom w:w="60" w:type="dxa"/>
+              <w:left w:w="70" w:type="dxa"/>
+              <w:right w:w="70" w:type="dxa"/>
+            </w:tcMar>
           </w:tcPr>
           <w:p>
             <w:pPr>
-              <w:keepNext/>
-              <w:spacing w:after="0" w:line="240" w:lineRule="auto"/>
+              <w:spacing w:line="252" w:lineRule="auto" w:before="20" w:after="20"/>
             </w:pPr>
-            <w:r/>
             <w:r>
               <w:rPr>
-                <w:rFonts w:ascii="Times New Roman" w:hAnsi="Times New Roman" w:eastAsia="Times New Roman"/>
-                <w:b w:val="0"/>
-                <w:i w:val="0"/>
-                <w:sz w:val="22"/>
+                <w:rFonts w:ascii="Times New Roman" w:hAnsi="Times New Roman"/>
+                <w:sz w:val="18"/>
               </w:rPr>
-              <w:t>Показывает свободные интервалы</w:t>
+              <w:t>Одна бронь успешно подтверждается, остальным возвращается сообщение о занятости стола</w:t>
+            </w:r>
+          </w:p>
+        </w:tc>
+        <w:tc>
+          <w:tcPr>
+            <w:tcW w:type="dxa" w:w="1872"/>
+            <w:tcMar>
+              <w:top w:w="60" w:type="dxa"/>
+              <w:bottom w:w="60" w:type="dxa"/>
+              <w:left w:w="70" w:type="dxa"/>
+              <w:right w:w="70" w:type="dxa"/>
+            </w:tcMar>
+          </w:tcPr>
+          <w:p>
+            <w:pPr>
+              <w:spacing w:line="252" w:lineRule="auto" w:before="20" w:after="20"/>
+            </w:pPr>
+            <w:r>
+              <w:rPr>
+                <w:rFonts w:ascii="Times New Roman" w:hAnsi="Times New Roman"/>
+                <w:sz w:val="18"/>
+              </w:rPr>
+              <w:t>Публикация блокируется, возвращается ошибка с перечнем конфликтующих броней</w:t>
+            </w:r>
+          </w:p>
+        </w:tc>
+        <w:tc>
+          <w:tcPr>
+            <w:tcW w:type="dxa" w:w="1872"/>
+            <w:tcMar>
+              <w:top w:w="60" w:type="dxa"/>
+              <w:bottom w:w="60" w:type="dxa"/>
+              <w:left w:w="70" w:type="dxa"/>
+              <w:right w:w="70" w:type="dxa"/>
+            </w:tcMar>
+          </w:tcPr>
+          <w:p>
+            <w:pPr>
+              <w:spacing w:line="252" w:lineRule="auto" w:before="20" w:after="20"/>
+            </w:pPr>
+            <w:r>
+              <w:rPr>
+                <w:rFonts w:ascii="Times New Roman" w:hAnsi="Times New Roman"/>
+                <w:sz w:val="18"/>
+              </w:rPr>
+              <w:t>Плавный рендеринг перемещения объектов без задержек и фризов интерфейса</w:t>
             </w:r>
           </w:p>
         </w:tc>
       </w:tr>
       <w:tr>
-        <w:trPr>
-          <w:cantSplit/>
-        </w:trPr>
         <w:tc>
           <w:tcPr>
-            <w:tcW w:type="dxa" w:w="1928"/>
+            <w:tcW w:type="dxa" w:w="1872"/>
+            <w:tcMar>
+              <w:top w:w="60" w:type="dxa"/>
+              <w:bottom w:w="60" w:type="dxa"/>
+              <w:left w:w="70" w:type="dxa"/>
+              <w:right w:w="70" w:type="dxa"/>
+            </w:tcMar>
+            <w:shd w:fill="F4F5F7"/>
           </w:tcPr>
           <w:p>
             <w:pPr>
-              <w:keepNext/>
-              <w:spacing w:after="0" w:line="240" w:lineRule="auto"/>
+              <w:spacing w:line="252" w:lineRule="auto" w:before="20" w:after="20"/>
             </w:pPr>
-            <w:r/>
             <w:r>
               <w:rPr>
-                <w:rFonts w:ascii="Times New Roman" w:hAnsi="Times New Roman" w:eastAsia="Times New Roman"/>
-                <w:b w:val="0"/>
-                <w:i w:val="0"/>
-                <w:sz w:val="22"/>
+                <w:rFonts w:ascii="Times New Roman" w:hAnsi="Times New Roman"/>
+                <w:b/>
+                <w:sz w:val="18"/>
               </w:rPr>
               <w:t>Мера отклика</w:t>
             </w:r>
@@ -710,43 +1108,93 @@
         </w:tc>
         <w:tc>
           <w:tcPr>
-            <w:tcW w:type="dxa" w:w="3515"/>
+            <w:tcW w:type="dxa" w:w="1872"/>
+            <w:tcMar>
+              <w:top w:w="60" w:type="dxa"/>
+              <w:bottom w:w="60" w:type="dxa"/>
+              <w:left w:w="70" w:type="dxa"/>
+              <w:right w:w="70" w:type="dxa"/>
+            </w:tcMar>
           </w:tcPr>
           <w:p>
             <w:pPr>
-              <w:keepNext/>
-              <w:spacing w:after="0" w:line="240" w:lineRule="auto"/>
+              <w:spacing w:line="252" w:lineRule="auto" w:before="20" w:after="20"/>
             </w:pPr>
-            <w:r/>
             <w:r>
               <w:rPr>
-                <w:rFonts w:ascii="Times New Roman" w:hAnsi="Times New Roman" w:eastAsia="Times New Roman"/>
-                <w:b w:val="0"/>
-                <w:i w:val="0"/>
-                <w:sz w:val="22"/>
+                <w:rFonts w:ascii="Times New Roman" w:hAnsi="Times New Roman"/>
+                <w:sz w:val="18"/>
               </w:rPr>
-              <w:t>По какому числу проверяем?</w:t>
+              <w:t>p95 времени отклика ≤ 1.5 с, доля ошибок HTTP 5xx ≤ 0.1%</w:t>
             </w:r>
           </w:p>
         </w:tc>
         <w:tc>
           <w:tcPr>
-            <w:tcW w:type="dxa" w:w="4195"/>
+            <w:tcW w:type="dxa" w:w="1872"/>
+            <w:tcMar>
+              <w:top w:w="60" w:type="dxa"/>
+              <w:bottom w:w="60" w:type="dxa"/>
+              <w:left w:w="70" w:type="dxa"/>
+              <w:right w:w="70" w:type="dxa"/>
+            </w:tcMar>
           </w:tcPr>
           <w:p>
             <w:pPr>
-              <w:keepNext/>
-              <w:spacing w:after="0" w:line="240" w:lineRule="auto"/>
+              <w:spacing w:line="252" w:lineRule="auto" w:before="20" w:after="20"/>
             </w:pPr>
-            <w:r/>
             <w:r>
               <w:rPr>
-                <w:rFonts w:ascii="Times New Roman" w:hAnsi="Times New Roman" w:eastAsia="Times New Roman"/>
-                <w:b w:val="0"/>
-                <w:i w:val="0"/>
-                <w:sz w:val="22"/>
+                <w:rFonts w:ascii="Times New Roman" w:hAnsi="Times New Roman"/>
+                <w:sz w:val="18"/>
               </w:rPr>
-              <w:t>p95 ≤ 2 с, ошибок ≤ 1%</w:t>
+              <w:t>Ровно 1 бронь создана, 0 случаев овербукинга, время фиксации ≤ 500 мс</w:t>
+            </w:r>
+          </w:p>
+        </w:tc>
+        <w:tc>
+          <w:tcPr>
+            <w:tcW w:type="dxa" w:w="1872"/>
+            <w:tcMar>
+              <w:top w:w="60" w:type="dxa"/>
+              <w:bottom w:w="60" w:type="dxa"/>
+              <w:left w:w="70" w:type="dxa"/>
+              <w:right w:w="70" w:type="dxa"/>
+            </w:tcMar>
+          </w:tcPr>
+          <w:p>
+            <w:pPr>
+              <w:spacing w:line="252" w:lineRule="auto" w:before="20" w:after="20"/>
+            </w:pPr>
+            <w:r>
+              <w:rPr>
+                <w:rFonts w:ascii="Times New Roman" w:hAnsi="Times New Roman"/>
+                <w:sz w:val="18"/>
+              </w:rPr>
+              <w:t>100% блокировка опасных публикаций, целостность броней сохранена</w:t>
+            </w:r>
+          </w:p>
+        </w:tc>
+        <w:tc>
+          <w:tcPr>
+            <w:tcW w:type="dxa" w:w="1872"/>
+            <w:tcMar>
+              <w:top w:w="60" w:type="dxa"/>
+              <w:bottom w:w="60" w:type="dxa"/>
+              <w:left w:w="70" w:type="dxa"/>
+              <w:right w:w="70" w:type="dxa"/>
+            </w:tcMar>
+          </w:tcPr>
+          <w:p>
+            <w:pPr>
+              <w:spacing w:line="252" w:lineRule="auto" w:before="20" w:after="20"/>
+            </w:pPr>
+            <w:r>
+              <w:rPr>
+                <w:rFonts w:ascii="Times New Roman" w:hAnsi="Times New Roman"/>
+                <w:sz w:val="18"/>
+              </w:rPr>
+              <w:t>Частота кадров рендеринга ≥ 50 fps, задержка реакции drag-and-drop ≤ 16 мс</w:t>
             </w:r>
           </w:p>
         </w:tc>
@@ -754,71 +1202,850 @@
     </w:tbl>
     <w:p>
       <w:pPr>
-        <w:spacing w:before="0" w:after="40"/>
+        <w:spacing w:before="0" w:after="120" w:line="276" w:lineRule="auto"/>
+        <w:jc w:val="left"/>
       </w:pPr>
     </w:p>
     <w:p>
       <w:pPr>
-        <w:keepNext/>
-        <w:spacing w:before="0" w:after="80"/>
-        <w:jc w:val="both"/>
+        <w:spacing w:before="120" w:after="80" w:line="276" w:lineRule="auto"/>
+        <w:jc w:val="left"/>
       </w:pPr>
       <w:r>
         <w:rPr>
-          <w:rFonts w:ascii="Times New Roman" w:hAnsi="Times New Roman" w:eastAsia="Times New Roman"/>
-          <w:b w:val="0"/>
+          <w:rFonts w:ascii="Times New Roman" w:hAnsi="Times New Roman"/>
+          <w:b/>
           <w:i w:val="0"/>
+          <w:sz w:val="26"/>
         </w:rPr>
-        <w:t>Сценарий — инструмент мышления, а не форма сдачи. Он не даёт пропустить нагрузку, условия или критерий успеха. Из него собирается одна итоговая формулировка, и именно она попадает в перечень требований (бланк 8):</w:t>
+        <w:t>5. Перечень проверяемых требований к качеству (Бланк 8)</w:t>
       </w:r>
     </w:p>
     <w:p>
       <w:pPr>
-        <w:spacing w:before="40" w:after="120"/>
-        <w:ind w:left="340"/>
+        <w:spacing w:before="0" w:after="120" w:line="276" w:lineRule="auto"/>
+        <w:jc w:val="left"/>
       </w:pPr>
       <w:r>
         <w:rPr>
-          <w:rFonts w:ascii="Times New Roman" w:hAnsi="Times New Roman" w:eastAsia="Times New Roman"/>
+          <w:rFonts w:ascii="Times New Roman" w:hAnsi="Times New Roman"/>
           <w:b w:val="0"/>
-          <w:i/>
-          <w:sz w:val="22"/>
+          <w:i w:val="0"/>
+          <w:sz w:val="24"/>
         </w:rPr>
-        <w:t>«В час наибольшей записи при 200 одновременно активных клиентах сервис записи показывает свободные интервалы; p95 времени ответа не больше 2 секунд, доля ошибок не больше 1%».</w:t>
+        <w:t>Итоговые формулировки требований, привязанные к Use Case проекта, с описанием методов проверки и обоснованием значений:</w:t>
+      </w:r>
+    </w:p>
+    <w:tbl>
+      <w:tblPr>
+        <w:tblW w:type="auto" w:w="0"/>
+        <w:jc w:val="center"/>
+        <w:tblLook w:firstColumn="1" w:firstRow="1" w:lastColumn="0" w:lastRow="0" w:noHBand="0" w:noVBand="1" w:val="04A0"/>
+      </w:tblPr>
+      <w:tblGrid>
+        <w:gridCol w:w="1872"/>
+        <w:gridCol w:w="1872"/>
+        <w:gridCol w:w="1872"/>
+        <w:gridCol w:w="1872"/>
+        <w:gridCol w:w="1872"/>
+      </w:tblGrid>
+      <w:tr>
+        <w:tc>
+          <w:tcPr>
+            <w:tcW w:type="dxa" w:w="1872"/>
+            <w:tcMar>
+              <w:top w:w="80" w:type="dxa"/>
+              <w:bottom w:w="80" w:type="dxa"/>
+              <w:left w:w="80" w:type="dxa"/>
+              <w:right w:w="80" w:type="dxa"/>
+            </w:tcMar>
+            <w:shd w:fill="EAECEF"/>
+          </w:tcPr>
+          <w:p>
+            <w:pPr>
+              <w:jc w:val="center"/>
+            </w:pPr>
+            <w:r>
+              <w:rPr>
+                <w:rFonts w:ascii="Times New Roman" w:hAnsi="Times New Roman"/>
+                <w:b/>
+                <w:sz w:val="19"/>
+              </w:rPr>
+              <w:t>№</w:t>
+            </w:r>
+          </w:p>
+        </w:tc>
+        <w:tc>
+          <w:tcPr>
+            <w:tcW w:type="dxa" w:w="1872"/>
+            <w:tcMar>
+              <w:top w:w="80" w:type="dxa"/>
+              <w:bottom w:w="80" w:type="dxa"/>
+              <w:left w:w="80" w:type="dxa"/>
+              <w:right w:w="80" w:type="dxa"/>
+            </w:tcMar>
+            <w:shd w:fill="EAECEF"/>
+          </w:tcPr>
+          <w:p>
+            <w:pPr>
+              <w:jc w:val="center"/>
+            </w:pPr>
+            <w:r>
+              <w:rPr>
+                <w:rFonts w:ascii="Times New Roman" w:hAnsi="Times New Roman"/>
+                <w:b/>
+                <w:sz w:val="19"/>
+              </w:rPr>
+              <w:t>Требование к качеству в проверяемой форме</w:t>
+            </w:r>
+          </w:p>
+        </w:tc>
+        <w:tc>
+          <w:tcPr>
+            <w:tcW w:type="dxa" w:w="1872"/>
+            <w:tcMar>
+              <w:top w:w="80" w:type="dxa"/>
+              <w:bottom w:w="80" w:type="dxa"/>
+              <w:left w:w="80" w:type="dxa"/>
+              <w:right w:w="80" w:type="dxa"/>
+            </w:tcMar>
+            <w:shd w:fill="EAECEF"/>
+          </w:tcPr>
+          <w:p>
+            <w:pPr>
+              <w:jc w:val="center"/>
+            </w:pPr>
+            <w:r>
+              <w:rPr>
+                <w:rFonts w:ascii="Times New Roman" w:hAnsi="Times New Roman"/>
+                <w:b/>
+                <w:sz w:val="19"/>
+              </w:rPr>
+              <w:t>Как проверить (метод приемки)</w:t>
+            </w:r>
+          </w:p>
+        </w:tc>
+        <w:tc>
+          <w:tcPr>
+            <w:tcW w:type="dxa" w:w="1872"/>
+            <w:tcMar>
+              <w:top w:w="80" w:type="dxa"/>
+              <w:bottom w:w="80" w:type="dxa"/>
+              <w:left w:w="80" w:type="dxa"/>
+              <w:right w:w="80" w:type="dxa"/>
+            </w:tcMar>
+            <w:shd w:fill="EAECEF"/>
+          </w:tcPr>
+          <w:p>
+            <w:pPr>
+              <w:jc w:val="center"/>
+            </w:pPr>
+            <w:r>
+              <w:rPr>
+                <w:rFonts w:ascii="Times New Roman" w:hAnsi="Times New Roman"/>
+                <w:b/>
+                <w:sz w:val="19"/>
+              </w:rPr>
+              <w:t>Связанный Use Case и шаг</w:t>
+            </w:r>
+          </w:p>
+        </w:tc>
+        <w:tc>
+          <w:tcPr>
+            <w:tcW w:type="dxa" w:w="1872"/>
+            <w:tcMar>
+              <w:top w:w="80" w:type="dxa"/>
+              <w:bottom w:w="80" w:type="dxa"/>
+              <w:left w:w="80" w:type="dxa"/>
+              <w:right w:w="80" w:type="dxa"/>
+            </w:tcMar>
+            <w:shd w:fill="EAECEF"/>
+          </w:tcPr>
+          <w:p>
+            <w:pPr>
+              <w:jc w:val="center"/>
+            </w:pPr>
+            <w:r>
+              <w:rPr>
+                <w:rFonts w:ascii="Times New Roman" w:hAnsi="Times New Roman"/>
+                <w:b/>
+                <w:sz w:val="19"/>
+              </w:rPr>
+              <w:t>Откуда значение / Обоснование</w:t>
+            </w:r>
+          </w:p>
+        </w:tc>
+      </w:tr>
+      <w:tr>
+        <w:tc>
+          <w:tcPr>
+            <w:tcW w:type="dxa" w:w="1872"/>
+            <w:tcMar>
+              <w:top w:w="60" w:type="dxa"/>
+              <w:bottom w:w="60" w:type="dxa"/>
+              <w:left w:w="70" w:type="dxa"/>
+              <w:right w:w="70" w:type="dxa"/>
+            </w:tcMar>
+            <w:shd w:fill="F4F5F7"/>
+          </w:tcPr>
+          <w:p>
+            <w:pPr>
+              <w:spacing w:line="252" w:lineRule="auto" w:before="20" w:after="20"/>
+              <w:jc w:val="center"/>
+            </w:pPr>
+            <w:r>
+              <w:rPr>
+                <w:rFonts w:ascii="Times New Roman" w:hAnsi="Times New Roman"/>
+                <w:b/>
+                <w:sz w:val="17"/>
+              </w:rPr>
+              <w:t>1</w:t>
+            </w:r>
+          </w:p>
+        </w:tc>
+        <w:tc>
+          <w:tcPr>
+            <w:tcW w:type="dxa" w:w="1872"/>
+            <w:tcMar>
+              <w:top w:w="60" w:type="dxa"/>
+              <w:bottom w:w="60" w:type="dxa"/>
+              <w:left w:w="70" w:type="dxa"/>
+              <w:right w:w="70" w:type="dxa"/>
+            </w:tcMar>
+          </w:tcPr>
+          <w:p>
+            <w:pPr>
+              <w:spacing w:line="252" w:lineRule="auto" w:before="20" w:after="20"/>
+            </w:pPr>
+            <w:r>
+              <w:rPr>
+                <w:rFonts w:ascii="Times New Roman" w:hAnsi="Times New Roman"/>
+                <w:sz w:val="17"/>
+              </w:rPr>
+              <w:t>В пиковый период нагрузки при 100 одновременно активных веб-пользователях сервис бронирования рассчитывает доступность столов и отдает 2D-схему за время p95 ≤ 1.5 с при доле ошибок менее 0.1%.</w:t>
+            </w:r>
+          </w:p>
+        </w:tc>
+        <w:tc>
+          <w:tcPr>
+            <w:tcW w:type="dxa" w:w="1872"/>
+            <w:tcMar>
+              <w:top w:w="60" w:type="dxa"/>
+              <w:bottom w:w="60" w:type="dxa"/>
+              <w:left w:w="70" w:type="dxa"/>
+              <w:right w:w="70" w:type="dxa"/>
+            </w:tcMar>
+          </w:tcPr>
+          <w:p>
+            <w:pPr>
+              <w:spacing w:line="252" w:lineRule="auto" w:before="20" w:after="20"/>
+            </w:pPr>
+            <w:r>
+              <w:rPr>
+                <w:rFonts w:ascii="Times New Roman" w:hAnsi="Times New Roman"/>
+                <w:sz w:val="17"/>
+              </w:rPr>
+              <w:t>Нагрузочный автотест (k6) сценария запроса слотов доступности столов залов на тестовом стенде.</w:t>
+            </w:r>
+          </w:p>
+        </w:tc>
+        <w:tc>
+          <w:tcPr>
+            <w:tcW w:type="dxa" w:w="1872"/>
+            <w:tcMar>
+              <w:top w:w="60" w:type="dxa"/>
+              <w:bottom w:w="60" w:type="dxa"/>
+              <w:left w:w="70" w:type="dxa"/>
+              <w:right w:w="70" w:type="dxa"/>
+            </w:tcMar>
+          </w:tcPr>
+          <w:p>
+            <w:pPr>
+              <w:spacing w:line="252" w:lineRule="auto" w:before="20" w:after="20"/>
+            </w:pPr>
+            <w:r>
+              <w:rPr>
+                <w:rFonts w:ascii="Times New Roman" w:hAnsi="Times New Roman"/>
+                <w:sz w:val="17"/>
+              </w:rPr>
+              <w:t>UC-1: Поиск и выбор стола на 2D-схеме зала (Шаг 2: Отображение доступности)</w:t>
+            </w:r>
+          </w:p>
+        </w:tc>
+        <w:tc>
+          <w:tcPr>
+            <w:tcW w:type="dxa" w:w="1872"/>
+            <w:tcMar>
+              <w:top w:w="60" w:type="dxa"/>
+              <w:bottom w:w="60" w:type="dxa"/>
+              <w:left w:w="70" w:type="dxa"/>
+              <w:right w:w="70" w:type="dxa"/>
+            </w:tcMar>
+          </w:tcPr>
+          <w:p>
+            <w:pPr>
+              <w:spacing w:line="252" w:lineRule="auto" w:before="20" w:after="20"/>
+            </w:pPr>
+            <w:r>
+              <w:rPr>
+                <w:rFonts w:ascii="Times New Roman" w:hAnsi="Times New Roman"/>
+                <w:sz w:val="17"/>
+              </w:rPr>
+              <w:t>ТЗ, §10 (требования производительности интерактивного веб-клиента)</w:t>
+            </w:r>
+          </w:p>
+        </w:tc>
+      </w:tr>
+      <w:tr>
+        <w:tc>
+          <w:tcPr>
+            <w:tcW w:type="dxa" w:w="1872"/>
+            <w:tcMar>
+              <w:top w:w="60" w:type="dxa"/>
+              <w:bottom w:w="60" w:type="dxa"/>
+              <w:left w:w="70" w:type="dxa"/>
+              <w:right w:w="70" w:type="dxa"/>
+            </w:tcMar>
+            <w:shd w:fill="F4F5F7"/>
+          </w:tcPr>
+          <w:p>
+            <w:pPr>
+              <w:spacing w:line="252" w:lineRule="auto" w:before="20" w:after="20"/>
+              <w:jc w:val="center"/>
+            </w:pPr>
+            <w:r>
+              <w:rPr>
+                <w:rFonts w:ascii="Times New Roman" w:hAnsi="Times New Roman"/>
+                <w:b/>
+                <w:sz w:val="17"/>
+              </w:rPr>
+              <w:t>2</w:t>
+            </w:r>
+          </w:p>
+        </w:tc>
+        <w:tc>
+          <w:tcPr>
+            <w:tcW w:type="dxa" w:w="1872"/>
+            <w:tcMar>
+              <w:top w:w="60" w:type="dxa"/>
+              <w:bottom w:w="60" w:type="dxa"/>
+              <w:left w:w="70" w:type="dxa"/>
+              <w:right w:w="70" w:type="dxa"/>
+            </w:tcMar>
+          </w:tcPr>
+          <w:p>
+            <w:pPr>
+              <w:spacing w:line="252" w:lineRule="auto" w:before="20" w:after="20"/>
+            </w:pPr>
+            <w:r>
+              <w:rPr>
+                <w:rFonts w:ascii="Times New Roman" w:hAnsi="Times New Roman"/>
+                <w:sz w:val="17"/>
+              </w:rPr>
+              <w:t>При параллельной одновременной попытке бронирования одного и того же стола несколькими гостями исключается овербукинг: подтверждается ровно одна бронь, остальным возвращается корректный статус недоступности стола с предложением альтернатив.</w:t>
+            </w:r>
+          </w:p>
+        </w:tc>
+        <w:tc>
+          <w:tcPr>
+            <w:tcW w:type="dxa" w:w="1872"/>
+            <w:tcMar>
+              <w:top w:w="60" w:type="dxa"/>
+              <w:bottom w:w="60" w:type="dxa"/>
+              <w:left w:w="70" w:type="dxa"/>
+              <w:right w:w="70" w:type="dxa"/>
+            </w:tcMar>
+          </w:tcPr>
+          <w:p>
+            <w:pPr>
+              <w:spacing w:line="252" w:lineRule="auto" w:before="20" w:after="20"/>
+            </w:pPr>
+            <w:r>
+              <w:rPr>
+                <w:rFonts w:ascii="Times New Roman" w:hAnsi="Times New Roman"/>
+                <w:sz w:val="17"/>
+              </w:rPr>
+              <w:t>Интеграционный автотест параллельных транзакций бронирования (Vitest / Supertest с блокировкой слота на уровне БД).</w:t>
+            </w:r>
+          </w:p>
+        </w:tc>
+        <w:tc>
+          <w:tcPr>
+            <w:tcW w:type="dxa" w:w="1872"/>
+            <w:tcMar>
+              <w:top w:w="60" w:type="dxa"/>
+              <w:bottom w:w="60" w:type="dxa"/>
+              <w:left w:w="70" w:type="dxa"/>
+              <w:right w:w="70" w:type="dxa"/>
+            </w:tcMar>
+          </w:tcPr>
+          <w:p>
+            <w:pPr>
+              <w:spacing w:line="252" w:lineRule="auto" w:before="20" w:after="20"/>
+            </w:pPr>
+            <w:r>
+              <w:rPr>
+                <w:rFonts w:ascii="Times New Roman" w:hAnsi="Times New Roman"/>
+                <w:sz w:val="17"/>
+              </w:rPr>
+              <w:t>UC-1: Оформление бронирования стола (Шаг 4: Подтверждение брони)</w:t>
+            </w:r>
+          </w:p>
+        </w:tc>
+        <w:tc>
+          <w:tcPr>
+            <w:tcW w:type="dxa" w:w="1872"/>
+            <w:tcMar>
+              <w:top w:w="60" w:type="dxa"/>
+              <w:bottom w:w="60" w:type="dxa"/>
+              <w:left w:w="70" w:type="dxa"/>
+              <w:right w:w="70" w:type="dxa"/>
+            </w:tcMar>
+          </w:tcPr>
+          <w:p>
+            <w:pPr>
+              <w:spacing w:line="252" w:lineRule="auto" w:before="20" w:after="20"/>
+            </w:pPr>
+            <w:r>
+              <w:rPr>
+                <w:rFonts w:ascii="Times New Roman" w:hAnsi="Times New Roman"/>
+                <w:sz w:val="17"/>
+              </w:rPr>
+              <w:t>ТЗ, §8 и §9 (бизнес-правило строгой защиты от двойных броней)</w:t>
+            </w:r>
+          </w:p>
+        </w:tc>
+      </w:tr>
+      <w:tr>
+        <w:tc>
+          <w:tcPr>
+            <w:tcW w:type="dxa" w:w="1872"/>
+            <w:tcMar>
+              <w:top w:w="60" w:type="dxa"/>
+              <w:bottom w:w="60" w:type="dxa"/>
+              <w:left w:w="70" w:type="dxa"/>
+              <w:right w:w="70" w:type="dxa"/>
+            </w:tcMar>
+            <w:shd w:fill="F4F5F7"/>
+          </w:tcPr>
+          <w:p>
+            <w:pPr>
+              <w:spacing w:line="252" w:lineRule="auto" w:before="20" w:after="20"/>
+              <w:jc w:val="center"/>
+            </w:pPr>
+            <w:r>
+              <w:rPr>
+                <w:rFonts w:ascii="Times New Roman" w:hAnsi="Times New Roman"/>
+                <w:b/>
+                <w:sz w:val="17"/>
+              </w:rPr>
+              <w:t>3</w:t>
+            </w:r>
+          </w:p>
+        </w:tc>
+        <w:tc>
+          <w:tcPr>
+            <w:tcW w:type="dxa" w:w="1872"/>
+            <w:tcMar>
+              <w:top w:w="60" w:type="dxa"/>
+              <w:bottom w:w="60" w:type="dxa"/>
+              <w:left w:w="70" w:type="dxa"/>
+              <w:right w:w="70" w:type="dxa"/>
+            </w:tcMar>
+          </w:tcPr>
+          <w:p>
+            <w:pPr>
+              <w:spacing w:line="252" w:lineRule="auto" w:before="20" w:after="20"/>
+            </w:pPr>
+            <w:r>
+              <w:rPr>
+                <w:rFonts w:ascii="Times New Roman" w:hAnsi="Times New Roman"/>
+                <w:sz w:val="17"/>
+              </w:rPr>
+              <w:t>Расчет доступности столов автоматически учитывает технический буфер 15 минут после окончания каждой брони; ни один стол не может быть забронирован на интервал, пересекающийся с буфером подготовки.</w:t>
+            </w:r>
+          </w:p>
+        </w:tc>
+        <w:tc>
+          <w:tcPr>
+            <w:tcW w:type="dxa" w:w="1872"/>
+            <w:tcMar>
+              <w:top w:w="60" w:type="dxa"/>
+              <w:bottom w:w="60" w:type="dxa"/>
+              <w:left w:w="70" w:type="dxa"/>
+              <w:right w:w="70" w:type="dxa"/>
+            </w:tcMar>
+          </w:tcPr>
+          <w:p>
+            <w:pPr>
+              <w:spacing w:line="252" w:lineRule="auto" w:before="20" w:after="20"/>
+            </w:pPr>
+            <w:r>
+              <w:rPr>
+                <w:rFonts w:ascii="Times New Roman" w:hAnsi="Times New Roman"/>
+                <w:sz w:val="17"/>
+              </w:rPr>
+              <w:t>Юнит-тесты алгоритма пересечения временных интервалов (функция checkSlotOverlap в модуле booking).</w:t>
+            </w:r>
+          </w:p>
+        </w:tc>
+        <w:tc>
+          <w:tcPr>
+            <w:tcW w:type="dxa" w:w="1872"/>
+            <w:tcMar>
+              <w:top w:w="60" w:type="dxa"/>
+              <w:bottom w:w="60" w:type="dxa"/>
+              <w:left w:w="70" w:type="dxa"/>
+              <w:right w:w="70" w:type="dxa"/>
+            </w:tcMar>
+          </w:tcPr>
+          <w:p>
+            <w:pPr>
+              <w:spacing w:line="252" w:lineRule="auto" w:before="20" w:after="20"/>
+            </w:pPr>
+            <w:r>
+              <w:rPr>
+                <w:rFonts w:ascii="Times New Roman" w:hAnsi="Times New Roman"/>
+                <w:sz w:val="17"/>
+              </w:rPr>
+              <w:t>UC-1: Расчет слотов доступности стола (Шаг 3: Проверка пересечений)</w:t>
+            </w:r>
+          </w:p>
+        </w:tc>
+        <w:tc>
+          <w:tcPr>
+            <w:tcW w:type="dxa" w:w="1872"/>
+            <w:tcMar>
+              <w:top w:w="60" w:type="dxa"/>
+              <w:bottom w:w="60" w:type="dxa"/>
+              <w:left w:w="70" w:type="dxa"/>
+              <w:right w:w="70" w:type="dxa"/>
+            </w:tcMar>
+          </w:tcPr>
+          <w:p>
+            <w:pPr>
+              <w:spacing w:line="252" w:lineRule="auto" w:before="20" w:after="20"/>
+            </w:pPr>
+            <w:r>
+              <w:rPr>
+                <w:rFonts w:ascii="Times New Roman" w:hAnsi="Times New Roman"/>
+                <w:sz w:val="17"/>
+              </w:rPr>
+              <w:t>ТЗ, §6.2 и §8 (технологический буфер на уборку и подготовку стола)</w:t>
+            </w:r>
+          </w:p>
+        </w:tc>
+      </w:tr>
+      <w:tr>
+        <w:tc>
+          <w:tcPr>
+            <w:tcW w:type="dxa" w:w="1872"/>
+            <w:tcMar>
+              <w:top w:w="60" w:type="dxa"/>
+              <w:bottom w:w="60" w:type="dxa"/>
+              <w:left w:w="70" w:type="dxa"/>
+              <w:right w:w="70" w:type="dxa"/>
+            </w:tcMar>
+            <w:shd w:fill="F4F5F7"/>
+          </w:tcPr>
+          <w:p>
+            <w:pPr>
+              <w:spacing w:line="252" w:lineRule="auto" w:before="20" w:after="20"/>
+              <w:jc w:val="center"/>
+            </w:pPr>
+            <w:r>
+              <w:rPr>
+                <w:rFonts w:ascii="Times New Roman" w:hAnsi="Times New Roman"/>
+                <w:b/>
+                <w:sz w:val="17"/>
+              </w:rPr>
+              <w:t>4</w:t>
+            </w:r>
+          </w:p>
+        </w:tc>
+        <w:tc>
+          <w:tcPr>
+            <w:tcW w:type="dxa" w:w="1872"/>
+            <w:tcMar>
+              <w:top w:w="60" w:type="dxa"/>
+              <w:bottom w:w="60" w:type="dxa"/>
+              <w:left w:w="70" w:type="dxa"/>
+              <w:right w:w="70" w:type="dxa"/>
+            </w:tcMar>
+          </w:tcPr>
+          <w:p>
+            <w:pPr>
+              <w:spacing w:line="252" w:lineRule="auto" w:before="20" w:after="20"/>
+            </w:pPr>
+            <w:r>
+              <w:rPr>
+                <w:rFonts w:ascii="Times New Roman" w:hAnsi="Times New Roman"/>
+                <w:sz w:val="17"/>
+              </w:rPr>
+              <w:t>Публикация новой ревизии схемы зала блокируется валидатором с кодом HTTP 409 Conflict, если при редактировании удаляется стол или уменьшается количество мест стола, имеющего будущие активные бронирования (status = confirmed).</w:t>
+            </w:r>
+          </w:p>
+        </w:tc>
+        <w:tc>
+          <w:tcPr>
+            <w:tcW w:type="dxa" w:w="1872"/>
+            <w:tcMar>
+              <w:top w:w="60" w:type="dxa"/>
+              <w:bottom w:w="60" w:type="dxa"/>
+              <w:left w:w="70" w:type="dxa"/>
+              <w:right w:w="70" w:type="dxa"/>
+            </w:tcMar>
+          </w:tcPr>
+          <w:p>
+            <w:pPr>
+              <w:spacing w:line="252" w:lineRule="auto" w:before="20" w:after="20"/>
+            </w:pPr>
+            <w:r>
+              <w:rPr>
+                <w:rFonts w:ascii="Times New Roman" w:hAnsi="Times New Roman"/>
+                <w:sz w:val="17"/>
+              </w:rPr>
+              <w:t>Автотест API публикации схемы (/api/v1/layout/publish) при наличии активных подтвержденных броней в тестовой БД.</w:t>
+            </w:r>
+          </w:p>
+        </w:tc>
+        <w:tc>
+          <w:tcPr>
+            <w:tcW w:type="dxa" w:w="1872"/>
+            <w:tcMar>
+              <w:top w:w="60" w:type="dxa"/>
+              <w:bottom w:w="60" w:type="dxa"/>
+              <w:left w:w="70" w:type="dxa"/>
+              <w:right w:w="70" w:type="dxa"/>
+            </w:tcMar>
+          </w:tcPr>
+          <w:p>
+            <w:pPr>
+              <w:spacing w:line="252" w:lineRule="auto" w:before="20" w:after="20"/>
+            </w:pPr>
+            <w:r>
+              <w:rPr>
+                <w:rFonts w:ascii="Times New Roman" w:hAnsi="Times New Roman"/>
+                <w:sz w:val="17"/>
+              </w:rPr>
+              <w:t>UC-2: Публикация ревизии схемы зала (Шаг 3: Валидация перед релизом)</w:t>
+            </w:r>
+          </w:p>
+        </w:tc>
+        <w:tc>
+          <w:tcPr>
+            <w:tcW w:type="dxa" w:w="1872"/>
+            <w:tcMar>
+              <w:top w:w="60" w:type="dxa"/>
+              <w:bottom w:w="60" w:type="dxa"/>
+              <w:left w:w="70" w:type="dxa"/>
+              <w:right w:w="70" w:type="dxa"/>
+            </w:tcMar>
+          </w:tcPr>
+          <w:p>
+            <w:pPr>
+              <w:spacing w:line="252" w:lineRule="auto" w:before="20" w:after="20"/>
+            </w:pPr>
+            <w:r>
+              <w:rPr>
+                <w:rFonts w:ascii="Times New Roman" w:hAnsi="Times New Roman"/>
+                <w:sz w:val="17"/>
+              </w:rPr>
+              <w:t>ТЗ, §7.1 и §8 (защита целостности активных броней ресторана)</w:t>
+            </w:r>
+          </w:p>
+        </w:tc>
+      </w:tr>
+      <w:tr>
+        <w:tc>
+          <w:tcPr>
+            <w:tcW w:type="dxa" w:w="1872"/>
+            <w:tcMar>
+              <w:top w:w="60" w:type="dxa"/>
+              <w:bottom w:w="60" w:type="dxa"/>
+              <w:left w:w="70" w:type="dxa"/>
+              <w:right w:w="70" w:type="dxa"/>
+            </w:tcMar>
+            <w:shd w:fill="F4F5F7"/>
+          </w:tcPr>
+          <w:p>
+            <w:pPr>
+              <w:spacing w:line="252" w:lineRule="auto" w:before="20" w:after="20"/>
+              <w:jc w:val="center"/>
+            </w:pPr>
+            <w:r>
+              <w:rPr>
+                <w:rFonts w:ascii="Times New Roman" w:hAnsi="Times New Roman"/>
+                <w:b/>
+                <w:sz w:val="17"/>
+              </w:rPr>
+              <w:t>5</w:t>
+            </w:r>
+          </w:p>
+        </w:tc>
+        <w:tc>
+          <w:tcPr>
+            <w:tcW w:type="dxa" w:w="1872"/>
+            <w:tcMar>
+              <w:top w:w="60" w:type="dxa"/>
+              <w:bottom w:w="60" w:type="dxa"/>
+              <w:left w:w="70" w:type="dxa"/>
+              <w:right w:w="70" w:type="dxa"/>
+            </w:tcMar>
+          </w:tcPr>
+          <w:p>
+            <w:pPr>
+              <w:spacing w:line="252" w:lineRule="auto" w:before="20" w:after="20"/>
+            </w:pPr>
+            <w:r>
+              <w:rPr>
+                <w:rFonts w:ascii="Times New Roman" w:hAnsi="Times New Roman"/>
+                <w:sz w:val="17"/>
+              </w:rPr>
+              <w:t>Интерактивный SVG-холст конструктора схем обеспечивает плавное перемещение объектов (drag-and-drop) и масштабирование без зависаний интерфейса (частота рендеринга не ниже 50 fps, время отклика UI на перетаскивание стола ≤ 16 мс) на планах этажей, содержащих до 100 столов.</w:t>
+            </w:r>
+          </w:p>
+        </w:tc>
+        <w:tc>
+          <w:tcPr>
+            <w:tcW w:type="dxa" w:w="1872"/>
+            <w:tcMar>
+              <w:top w:w="60" w:type="dxa"/>
+              <w:bottom w:w="60" w:type="dxa"/>
+              <w:left w:w="70" w:type="dxa"/>
+              <w:right w:w="70" w:type="dxa"/>
+            </w:tcMar>
+          </w:tcPr>
+          <w:p>
+            <w:pPr>
+              <w:spacing w:line="252" w:lineRule="auto" w:before="20" w:after="20"/>
+            </w:pPr>
+            <w:r>
+              <w:rPr>
+                <w:rFonts w:ascii="Times New Roman" w:hAnsi="Times New Roman"/>
+                <w:sz w:val="17"/>
+              </w:rPr>
+              <w:t>Тестирование производительности рендеринга через Chrome DevTools Performance Profiler на эталонном стенде.</w:t>
+            </w:r>
+          </w:p>
+        </w:tc>
+        <w:tc>
+          <w:tcPr>
+            <w:tcW w:type="dxa" w:w="1872"/>
+            <w:tcMar>
+              <w:top w:w="60" w:type="dxa"/>
+              <w:bottom w:w="60" w:type="dxa"/>
+              <w:left w:w="70" w:type="dxa"/>
+              <w:right w:w="70" w:type="dxa"/>
+            </w:tcMar>
+          </w:tcPr>
+          <w:p>
+            <w:pPr>
+              <w:spacing w:line="252" w:lineRule="auto" w:before="20" w:after="20"/>
+            </w:pPr>
+            <w:r>
+              <w:rPr>
+                <w:rFonts w:ascii="Times New Roman" w:hAnsi="Times New Roman"/>
+                <w:sz w:val="17"/>
+              </w:rPr>
+              <w:t>UC-3: Редактирование схемы зала в 2D-конструкторе (Шаг 2: Расстановка столов)</w:t>
+            </w:r>
+          </w:p>
+        </w:tc>
+        <w:tc>
+          <w:tcPr>
+            <w:tcW w:type="dxa" w:w="1872"/>
+            <w:tcMar>
+              <w:top w:w="60" w:type="dxa"/>
+              <w:bottom w:w="60" w:type="dxa"/>
+              <w:left w:w="70" w:type="dxa"/>
+              <w:right w:w="70" w:type="dxa"/>
+            </w:tcMar>
+          </w:tcPr>
+          <w:p>
+            <w:pPr>
+              <w:spacing w:line="252" w:lineRule="auto" w:before="20" w:after="20"/>
+            </w:pPr>
+            <w:r>
+              <w:rPr>
+                <w:rFonts w:ascii="Times New Roman" w:hAnsi="Times New Roman"/>
+                <w:sz w:val="17"/>
+              </w:rPr>
+              <w:t>ТЗ, §3 и §10 (требования к архитектуре легковесного SVG-рендерера)</w:t>
+            </w:r>
+          </w:p>
+        </w:tc>
+      </w:tr>
+    </w:tbl>
+    <w:p>
+      <w:pPr>
+        <w:spacing w:before="0" w:after="120" w:line="276" w:lineRule="auto"/>
+        <w:jc w:val="left"/>
+      </w:pPr>
+    </w:p>
+    <w:p>
+      <w:pPr>
+        <w:spacing w:before="120" w:after="80" w:line="276" w:lineRule="auto"/>
+        <w:jc w:val="left"/>
+      </w:pPr>
+      <w:r>
+        <w:rPr>
+          <w:rFonts w:ascii="Times New Roman" w:hAnsi="Times New Roman"/>
+          <w:b/>
+          <w:i w:val="0"/>
+          <w:sz w:val="24"/>
+        </w:rPr>
+        <w:t>6. Критерии самопроверки требований</w:t>
       </w:r>
     </w:p>
     <w:p>
       <w:pPr>
-        <w:keepNext/>
-        <w:spacing w:before="160" w:after="60"/>
+        <w:spacing w:before="0" w:after="60" w:line="276" w:lineRule="auto"/>
+        <w:jc w:val="left"/>
       </w:pPr>
       <w:r>
         <w:rPr>
-          <w:rFonts w:ascii="Times New Roman" w:hAnsi="Times New Roman" w:eastAsia="Times New Roman"/>
-          <w:b/>
+          <w:rFonts w:ascii="Times New Roman" w:hAnsi="Times New Roman"/>
+          <w:b w:val="0"/>
           <w:i w:val="0"/>
           <w:sz w:val="24"/>
         </w:rPr>
-        <w:t>Проверьте себя</w:t>
+        <w:t>• Как инженер по тестированию или заказчик докажет выполнение требования? Для каждого требования определен конкретный метод проверки (нагрузочный тест k6, интеграционный тест Vitest, профилировщик Chrome DevTools, валидатор схем).</w:t>
       </w:r>
     </w:p>
     <w:p>
       <w:pPr>
-        <w:spacing w:before="0" w:after="80"/>
-        <w:jc w:val="both"/>
+        <w:spacing w:before="0" w:after="60" w:line="276" w:lineRule="auto"/>
+        <w:jc w:val="left"/>
       </w:pPr>
       <w:r>
         <w:rPr>
-          <w:rFonts w:ascii="Times New Roman" w:hAnsi="Times New Roman" w:eastAsia="Times New Roman"/>
+          <w:rFonts w:ascii="Times New Roman" w:hAnsi="Times New Roman"/>
           <w:b w:val="0"/>
           <w:i w:val="0"/>
+          <w:sz w:val="24"/>
         </w:rPr>
-        <w:t>Как тестировщик, инженер эксплуатации или заказчик на приёмке докажет, что требование выполнено? Если ответа нет, требование ещё не готово.</w:t>
+        <w:t>• Каждое количественное требование снабжено конкретной нагрузкой и условиями (пиковый час, 100 одновременных гостей, планы до 100 столов).</w:t>
+      </w:r>
+    </w:p>
+    <w:p>
+      <w:pPr>
+        <w:spacing w:before="0" w:after="120" w:line="276" w:lineRule="auto"/>
+        <w:jc w:val="left"/>
+      </w:pPr>
+      <w:r>
+        <w:rPr>
+          <w:rFonts w:ascii="Times New Roman" w:hAnsi="Times New Roman"/>
+          <w:b w:val="0"/>
+          <w:i w:val="0"/>
+          <w:sz w:val="24"/>
+        </w:rPr>
+        <w:t>• Все требования привязаны к конкретным шагам Use Case проекта и опираются на согласованное ТЗ системы Smart Restaurant.</w:t>
       </w:r>
     </w:p>
     <w:sectPr>
-      <w:pgSz w:w="11906" w:h="16838"/>
-      <w:pgMar w:top="1134" w:right="850" w:bottom="1134" w:left="1417" w:header="720" w:footer="720" w:gutter="0"/>
+      <w:pgSz w:w="12240" w:h="15840"/>
+      <w:pgMar w:top="1440" w:right="1440" w:bottom="1440" w:left="1440" w:header="720" w:footer="720" w:gutter="0"/>
       <w:cols w:space="720"/>
       <w:docGrid w:linePitch="360"/>
     </w:sectPr>
@@ -1189,13 +2416,6 @@
     <w:name w:val="Normal"/>
     <w:qFormat/>
     <w:rsid w:val="00FC693F"/>
-    <w:pPr>
-      <w:spacing w:after="80" w:line="264" w:lineRule="auto"/>
-    </w:pPr>
-    <w:rPr>
-      <w:rFonts w:ascii="Times New Roman" w:hAnsi="Times New Roman" w:eastAsia="Times New Roman"/>
-      <w:sz w:val="24"/>
-    </w:rPr>
   </w:style>
   <w:style w:type="paragraph" w:styleId="Header">
     <w:name w:val="header"/>

</xml_diff>